<commit_message>
No reference list should be working correctly
</commit_message>
<xml_diff>
--- a/docs/index.docx
+++ b/docs/index.docx
@@ -162,7 +162,7 @@
         <w:t xml:space="preserve"> </w:t>
       </w:r>
       <w:r>
-        <w:t xml:space="preserve">(kōura) have declined by up to 91%. Identifying key habitat requirements is essential to improve the conservation of crayfish facing multiple threats. To assess littoral habitat associations, we surveyed shoreline habitats in five Aotearoa lakes and modelled kōura occupancy, abundance, and biomass using generalised additive mixed models. Kōura occupancy increased with shoreline habitat complexity, particularly coarser substrate types and greater riparian vegetation cover. Elevated summer surface water temperatures were negatively associated with kōura occupancy and abundance, indicating reduced habitat suitability during warm periods. pH was positively correlated with kōura abundance and biomass. Our results suggest that the composition and physical structure of littoral habitats are important drivers of kōura distribution and abundance. As climatic drivers resulting in warmer water temperatures and reduced dissolved oxygen are difficult to manage, targeted protection and restoration of coarse substrate shoreline habitats may provide a practical conservation response.</w:t>
+        <w:t xml:space="preserve">(kōura) have declined by up to 91 %. Identifying key habitat requirements is essential to improve the conservation of crayfish facing multiple threats. To assess littoral habitat associations, we surveyed shoreline habitats in five Aotearoa lakes and modelled kōura occupancy, abundance, and biomass using generalised additive mixed models. Kōura occupancy increased with shoreline habitat complexity, particularly coarser substrate types and greater riparian vegetation cover. Elevated summer surface water temperatures were negatively associated with kōura occupancy and abundance, indicating reduced habitat suitability during warm periods. pH was positively correlated with kōura abundance and biomass. Our results suggest that the composition and physical structure of littoral habitats are important drivers of kōura distribution and abundance. As climatic drivers resulting in warmer water temperatures and reduced dissolved oxygen are difficult to manage, targeted protection and restoration of coarse substrate shoreline habitats may provide a practical conservation response.</w:t>
       </w:r>
     </w:p>
     <w:p>
@@ -1031,10 +1031,7 @@
         <w:t xml:space="preserve">(Kusabs et al., 2015b)</w:t>
       </w:r>
       <w:r>
-        <w:t xml:space="preserve">. Missing kōura weights due to failure of scale (n = 81) were estimated using a log₁₀–log₁₀ length–weight regression fitted to individuals with both measurements (n = 240), following standard approaches for weight length relationships in aquatic organisms</w:t>
-      </w:r>
-      <w:r>
-        <w:t xml:space="preserve"> </w:t>
+        <w:t xml:space="preserve">. Missing kōura weights due to failure of scale (n = 81) were estimated using a log₁₀–log₁₀ length–weight regression fitted to individuals with both measurements (n = 240), following standard approaches for weight length relationships in aquatic organisms (</w:t>
       </w:r>
       <w:hyperlink w:anchor="fig-length-weight">
         <w:r>
@@ -1044,6 +1041,15 @@
           <w:t xml:space="preserve">Figure 6</w:t>
         </w:r>
       </w:hyperlink>
+      <w:r>
+        <w:t xml:space="preserve">)</w:t>
+      </w:r>
+      <w:r>
+        <w:t xml:space="preserve"> </w:t>
+      </w:r>
+      <w:r>
+        <w:t xml:space="preserve">(Froese, 2006)</w:t>
+      </w:r>
       <w:r>
         <w:t xml:space="preserve">. Predicted values were back-transformed with a lognormal bias correction factor (10^{0.5</w:t>
       </w:r>
@@ -5635,7 +5641,7 @@
       </w:hyperlink>
     </w:p>
     <w:bookmarkEnd w:id="65"/>
-    <w:bookmarkStart w:id="214" w:name="supplementary-information"/>
+    <w:bookmarkStart w:id="226" w:name="supplementary-information"/>
     <w:p>
       <w:pPr>
         <w:pStyle w:val="Heading1"/>
@@ -19441,7 +19447,7 @@
         </w:r>
       </w:hyperlink>
     </w:p>
-    <w:bookmarkStart w:id="213" w:name="refs"/>
+    <w:bookmarkStart w:id="225" w:name="refs"/>
     <w:bookmarkStart w:id="79" w:name="ref-Albertson2018"/>
     <w:p>
       <w:pPr>
@@ -19514,13 +19520,25 @@
             <w:i/>
             <w:iCs/>
           </w:rPr>
-          <w:t xml:space="preserve">ameiurus nebulosus</w:t>
+          <w:t xml:space="preserve">Ameiurus nebulosus</w:t>
         </w:r>
         <w:r>
           <w:rPr>
             <w:rStyle w:val="Hyperlink"/>
           </w:rPr>
-          <w:t xml:space="preserve">) in lake taupo</w:t>
+          <w:t xml:space="preserve">) in</w:t>
+        </w:r>
+        <w:r>
+          <w:rPr>
+            <w:rStyle w:val="Hyperlink"/>
+          </w:rPr>
+          <w:t xml:space="preserve"> </w:t>
+        </w:r>
+        <w:r>
+          <w:rPr>
+            <w:rStyle w:val="Hyperlink"/>
+          </w:rPr>
+          <w:t xml:space="preserve">Lake Taupo</w:t>
         </w:r>
       </w:hyperlink>
       <w:r>
@@ -19541,10 +19559,46 @@
           <w:i/>
           <w:iCs/>
         </w:rPr>
-        <w:t xml:space="preserve">ameiurus nebulosus</w:t>
-      </w:r>
-      <w:r>
-        <w:t xml:space="preserve">) in lake taupo. In Managing invasive freshwater fish in new zealand: Proceedings of a workshop hosted by department of conservation, 10–12 may 2001, hamilton. Department of Conservation.</w:t>
+        <w:t xml:space="preserve">Ameiurus nebulosus</w:t>
+      </w:r>
+      <w:r>
+        <w:t xml:space="preserve">) in</w:t>
+      </w:r>
+      <w:r>
+        <w:t xml:space="preserve"> </w:t>
+      </w:r>
+      <w:r>
+        <w:t xml:space="preserve">Lake Taupo</w:t>
+      </w:r>
+      <w:r>
+        <w:t xml:space="preserve">. In Managing invasive freshwater fish in</w:t>
+      </w:r>
+      <w:r>
+        <w:t xml:space="preserve"> </w:t>
+      </w:r>
+      <w:r>
+        <w:t xml:space="preserve">New Zealand</w:t>
+      </w:r>
+      <w:r>
+        <w:t xml:space="preserve">: Proceedings of a workshop hosted by</w:t>
+      </w:r>
+      <w:r>
+        <w:t xml:space="preserve"> </w:t>
+      </w:r>
+      <w:r>
+        <w:t xml:space="preserve">Department of Conservation</w:t>
+      </w:r>
+      <w:r>
+        <w:t xml:space="preserve">, 10–12 may 2001,</w:t>
+      </w:r>
+      <w:r>
+        <w:t xml:space="preserve"> </w:t>
+      </w:r>
+      <w:r>
+        <w:t xml:space="preserve">Hamilton</w:t>
+      </w:r>
+      <w:r>
+        <w:t xml:space="preserve">. Department of Conservation.</w:t>
       </w:r>
     </w:p>
     <w:bookmarkEnd w:id="84"/>
@@ -19608,18 +19662,55 @@
       </w:r>
     </w:p>
     <w:bookmarkEnd w:id="88"/>
-    <w:bookmarkStart w:id="90" w:name="ref-Bunch2010"/>
+    <w:bookmarkStart w:id="90" w:name="ref-Broughton2017"/>
     <w:p>
       <w:pPr>
         <w:pStyle w:val="Bibliography"/>
       </w:pPr>
       <w:r>
+        <w:t xml:space="preserve">Broughton, R. J., I. D. Marsden, J. V. Hill, &amp; C. N. Glover, 2017. Behavioural, physiological and biochemical responses to aquatic hypoxia in the freshwater crayfish,</w:t>
+      </w:r>
+      <w:r>
+        <w:t xml:space="preserve"> </w:t>
+      </w:r>
+      <w:r>
+        <w:rPr>
+          <w:i/>
+          <w:iCs/>
+        </w:rPr>
+        <w:t xml:space="preserve">Paranephrops zealandicus</w:t>
+      </w:r>
+      <w:r>
+        <w:t xml:space="preserve">. Comparative Biochemistry and Physiology Part A: Molecular &amp; Integrative Physiology 212: 72–80.</w:t>
+      </w:r>
+      <w:r>
+        <w:t xml:space="preserve"> </w:t>
+      </w:r>
+      <w:hyperlink r:id="rId89">
+        <w:r>
+          <w:rPr>
+            <w:rStyle w:val="Hyperlink"/>
+          </w:rPr>
+          <w:t xml:space="preserve">https://doi.org/10.1016/j.cbpa.2017.07.013</w:t>
+        </w:r>
+      </w:hyperlink>
+      <w:r>
+        <w:t xml:space="preserve">.</w:t>
+      </w:r>
+    </w:p>
+    <w:bookmarkEnd w:id="90"/>
+    <w:bookmarkStart w:id="92" w:name="ref-Bunch2010"/>
+    <w:p>
+      <w:pPr>
+        <w:pStyle w:val="Bibliography"/>
+      </w:pPr>
+      <w:r>
         <w:t xml:space="preserve">Bunch, A. J., M. S. Allen, &amp; D. C. Gwinn, 2010. Spatial and temporal hypoxia dynamics in dense emergent macrophytes in a florida lake. Wetlands 30: 429–435.</w:t>
       </w:r>
       <w:r>
         <w:t xml:space="preserve"> </w:t>
       </w:r>
-      <w:hyperlink r:id="rId89">
+      <w:hyperlink r:id="rId91">
         <w:r>
           <w:rPr>
             <w:rStyle w:val="Hyperlink"/>
@@ -19631,8 +19722,8 @@
         <w:t xml:space="preserve">.</w:t>
       </w:r>
     </w:p>
-    <w:bookmarkEnd w:id="90"/>
-    <w:bookmarkStart w:id="92" w:name="ref-Capinha2013"/>
+    <w:bookmarkEnd w:id="92"/>
+    <w:bookmarkStart w:id="94" w:name="ref-Capinha2013"/>
     <w:p>
       <w:pPr>
         <w:pStyle w:val="Bibliography"/>
@@ -19643,7 +19734,7 @@
       <w:r>
         <w:t xml:space="preserve"> </w:t>
       </w:r>
-      <w:hyperlink r:id="rId91">
+      <w:hyperlink r:id="rId93">
         <w:r>
           <w:rPr>
             <w:rStyle w:val="Hyperlink"/>
@@ -19655,8 +19746,8 @@
         <w:t xml:space="preserve">.</w:t>
       </w:r>
     </w:p>
-    <w:bookmarkEnd w:id="92"/>
-    <w:bookmarkStart w:id="94" w:name="ref-Chambers1987"/>
+    <w:bookmarkEnd w:id="94"/>
+    <w:bookmarkStart w:id="96" w:name="ref-Chambers1987"/>
     <w:p>
       <w:pPr>
         <w:pStyle w:val="Bibliography"/>
@@ -19667,7 +19758,7 @@
       <w:r>
         <w:t xml:space="preserve"> </w:t>
       </w:r>
-      <w:hyperlink r:id="rId93">
+      <w:hyperlink r:id="rId95">
         <w:r>
           <w:rPr>
             <w:rStyle w:val="Hyperlink"/>
@@ -19679,29 +19770,81 @@
         <w:t xml:space="preserve">.</w:t>
       </w:r>
     </w:p>
-    <w:bookmarkEnd w:id="94"/>
-    <w:bookmarkStart w:id="95" w:name="ref-Collier1997"/>
+    <w:bookmarkEnd w:id="96"/>
+    <w:bookmarkStart w:id="98" w:name="ref-Coffey1988"/>
     <w:p>
       <w:pPr>
         <w:pStyle w:val="Bibliography"/>
       </w:pPr>
       <w:r>
-        <w:t xml:space="preserve">Collier, K. J., S. M. Parkyn, &amp; C. F. Rabeni, 1997. Koura: A keystone species. Water and Atmosphere 5: 18–20.</w:t>
+        <w:t xml:space="preserve">Coffey, B. T., &amp; J. S. Clayton, 1988. Contrasting deep-water macrophyte communities in two highly transparent</w:t>
+      </w:r>
+      <w:r>
+        <w:t xml:space="preserve"> </w:t>
+      </w:r>
+      <w:r>
+        <w:t xml:space="preserve">New Zealand</w:t>
+      </w:r>
+      <w:r>
+        <w:t xml:space="preserve"> </w:t>
+      </w:r>
+      <w:r>
+        <w:t xml:space="preserve">lakes and their possible association with freshwater crayfish,</w:t>
+      </w:r>
+      <w:r>
+        <w:t xml:space="preserve"> </w:t>
+      </w:r>
+      <w:r>
+        <w:rPr>
+          <w:i/>
+          <w:iCs/>
+        </w:rPr>
+        <w:t xml:space="preserve">Paranephrops</w:t>
+      </w:r>
+      <w:r>
+        <w:t xml:space="preserve"> </w:t>
+      </w:r>
+      <w:r>
+        <w:t xml:space="preserve">spp. New Zealand Journal of Marine and Freshwater Research 22: 225–230.</w:t>
+      </w:r>
+      <w:r>
+        <w:t xml:space="preserve"> </w:t>
+      </w:r>
+      <w:hyperlink r:id="rId97">
+        <w:r>
+          <w:rPr>
+            <w:rStyle w:val="Hyperlink"/>
+          </w:rPr>
+          <w:t xml:space="preserve">https://doi.org/10.1080/00288330.1988.9516294</w:t>
+        </w:r>
+      </w:hyperlink>
+      <w:r>
+        <w:t xml:space="preserve">.</w:t>
       </w:r>
     </w:p>
-    <w:bookmarkEnd w:id="95"/>
-    <w:bookmarkStart w:id="97" w:name="ref-Creed2004"/>
+    <w:bookmarkEnd w:id="98"/>
+    <w:bookmarkStart w:id="99" w:name="ref-Collier1997"/>
     <w:p>
       <w:pPr>
         <w:pStyle w:val="Bibliography"/>
       </w:pPr>
       <w:r>
+        <w:t xml:space="preserve">Collier, K. J., S. M. Parkyn, &amp; C. F. Rabeni, 1997. Koura: A keystone species. Water and Atmosphere 5: 18–20.</w:t>
+      </w:r>
+    </w:p>
+    <w:bookmarkEnd w:id="99"/>
+    <w:bookmarkStart w:id="101" w:name="ref-Creed2004"/>
+    <w:p>
+      <w:pPr>
+        <w:pStyle w:val="Bibliography"/>
+      </w:pPr>
+      <w:r>
         <w:t xml:space="preserve">Creed, R. P., &amp; J. M. Reed, 2004. Ecosystem engineering by crayfish in a headwater stream community. Journal of the North American Benthological Society 23: 224–236.</w:t>
       </w:r>
       <w:r>
         <w:t xml:space="preserve"> </w:t>
       </w:r>
-      <w:hyperlink r:id="rId96">
+      <w:hyperlink r:id="rId100">
         <w:r>
           <w:rPr>
             <w:rStyle w:val="Hyperlink"/>
@@ -19713,8 +19856,8 @@
         <w:t xml:space="preserve">.</w:t>
       </w:r>
     </w:p>
-    <w:bookmarkEnd w:id="97"/>
-    <w:bookmarkStart w:id="99" w:name="ref-Danilovic2022"/>
+    <w:bookmarkEnd w:id="101"/>
+    <w:bookmarkStart w:id="103" w:name="ref-Danilovic2022"/>
     <w:p>
       <w:pPr>
         <w:pStyle w:val="Bibliography"/>
@@ -19734,7 +19877,7 @@
       <w:r>
         <w:t xml:space="preserve"> </w:t>
       </w:r>
-      <w:hyperlink r:id="rId98">
+      <w:hyperlink r:id="rId102">
         <w:r>
           <w:rPr>
             <w:rStyle w:val="Hyperlink"/>
@@ -19746,8 +19889,8 @@
         <w:t xml:space="preserve">.</w:t>
       </w:r>
     </w:p>
-    <w:bookmarkEnd w:id="99"/>
-    <w:bookmarkStart w:id="101" w:name="ref-Dedual2002"/>
+    <w:bookmarkEnd w:id="103"/>
+    <w:bookmarkStart w:id="105" w:name="ref-Dedual2002"/>
     <w:p>
       <w:pPr>
         <w:pStyle w:val="Bibliography"/>
@@ -19758,7 +19901,7 @@
       <w:r>
         <w:t xml:space="preserve"> </w:t>
       </w:r>
-      <w:hyperlink r:id="rId100">
+      <w:hyperlink r:id="rId104">
         <w:r>
           <w:rPr>
             <w:rStyle w:val="Hyperlink"/>
@@ -19771,7 +19914,7 @@
             <w:i/>
             <w:iCs/>
           </w:rPr>
-          <w:t xml:space="preserve">ameiurus nebulosus</w:t>
+          <w:t xml:space="preserve">Ameiurus nebulosus</w:t>
         </w:r>
         <w:r>
           <w:rPr>
@@ -19783,7 +19926,55 @@
           <w:rPr>
             <w:rStyle w:val="Hyperlink"/>
           </w:rPr>
-          <w:t xml:space="preserve">lesueur 1819) in motuoapa bay, southern lake taupo,</w:t>
+          <w:t xml:space="preserve">Lesueur</w:t>
+        </w:r>
+        <w:r>
+          <w:rPr>
+            <w:rStyle w:val="Hyperlink"/>
+          </w:rPr>
+          <w:t xml:space="preserve"> </w:t>
+        </w:r>
+        <w:r>
+          <w:rPr>
+            <w:rStyle w:val="Hyperlink"/>
+          </w:rPr>
+          <w:t xml:space="preserve">1819) in</w:t>
+        </w:r>
+        <w:r>
+          <w:rPr>
+            <w:rStyle w:val="Hyperlink"/>
+          </w:rPr>
+          <w:t xml:space="preserve"> </w:t>
+        </w:r>
+        <w:r>
+          <w:rPr>
+            <w:rStyle w:val="Hyperlink"/>
+          </w:rPr>
+          <w:t xml:space="preserve">Motuoapa Bay</w:t>
+        </w:r>
+        <w:r>
+          <w:rPr>
+            <w:rStyle w:val="Hyperlink"/>
+          </w:rPr>
+          <w:t xml:space="preserve">, southern</w:t>
+        </w:r>
+        <w:r>
+          <w:rPr>
+            <w:rStyle w:val="Hyperlink"/>
+          </w:rPr>
+          <w:t xml:space="preserve"> </w:t>
+        </w:r>
+        <w:r>
+          <w:rPr>
+            <w:rStyle w:val="Hyperlink"/>
+          </w:rPr>
+          <w:t xml:space="preserve">Lake Taupo</w:t>
+        </w:r>
+        <w:r>
+          <w:rPr>
+            <w:rStyle w:val="Hyperlink"/>
+          </w:rPr>
+          <w:t xml:space="preserve">,</w:t>
         </w:r>
         <w:r>
           <w:rPr>
@@ -19802,8 +19993,8 @@
         <w:t xml:space="preserve">. In Thorstad, E. B., I. A. Fleming, &amp; T. F. Næsje (eds) Aquatic telemetry. Springer Netherlands. pp. 129–135.</w:t>
       </w:r>
     </w:p>
-    <w:bookmarkEnd w:id="101"/>
-    <w:bookmarkStart w:id="102" w:name="ref-Devcich1979"/>
+    <w:bookmarkEnd w:id="105"/>
+    <w:bookmarkStart w:id="106" w:name="ref-Devcich1979"/>
     <w:p>
       <w:pPr>
         <w:pStyle w:val="Bibliography"/>
@@ -19819,13 +20010,19 @@
           <w:i/>
           <w:iCs/>
         </w:rPr>
-        <w:t xml:space="preserve">paranephrops planifrons</w:t>
-      </w:r>
-      <w:r>
-        <w:t xml:space="preserve"> </w:t>
-      </w:r>
-      <w:r>
-        <w:t xml:space="preserve">white (</w:t>
+        <w:t xml:space="preserve">Paranephrops planifrons</w:t>
+      </w:r>
+      <w:r>
+        <w:t xml:space="preserve"> </w:t>
+      </w:r>
+      <w:r>
+        <w:t xml:space="preserve">White</w:t>
+      </w:r>
+      <w:r>
+        <w:t xml:space="preserve"> </w:t>
+      </w:r>
+      <w:r>
+        <w:t xml:space="preserve">(</w:t>
       </w:r>
       <w:r>
         <w:t xml:space="preserve">Decapoda</w:t>
@@ -19840,11 +20037,29 @@
         <w:t xml:space="preserve">Parastacidae</w:t>
       </w:r>
       <w:r>
-        <w:t xml:space="preserve">) in lake rotoiti, north island. PhD thesis, University of Waikato.</w:t>
+        <w:t xml:space="preserve">) in</w:t>
+      </w:r>
+      <w:r>
+        <w:t xml:space="preserve"> </w:t>
+      </w:r>
+      <w:r>
+        <w:t xml:space="preserve">Lake Rotoiti</w:t>
+      </w:r>
+      <w:r>
+        <w:t xml:space="preserve">,</w:t>
+      </w:r>
+      <w:r>
+        <w:t xml:space="preserve"> </w:t>
+      </w:r>
+      <w:r>
+        <w:t xml:space="preserve">North Island</w:t>
+      </w:r>
+      <w:r>
+        <w:t xml:space="preserve">. PhD thesis, University of Waikato.</w:t>
       </w:r>
     </w:p>
-    <w:bookmarkEnd w:id="102"/>
-    <w:bookmarkStart w:id="104" w:name="ref-Dumelle2023"/>
+    <w:bookmarkEnd w:id="106"/>
+    <w:bookmarkStart w:id="108" w:name="ref-Dumelle2023"/>
     <w:p>
       <w:pPr>
         <w:pStyle w:val="Bibliography"/>
@@ -19864,7 +20079,7 @@
       <w:r>
         <w:t xml:space="preserve"> </w:t>
       </w:r>
-      <w:hyperlink r:id="rId103">
+      <w:hyperlink r:id="rId107">
         <w:r>
           <w:rPr>
             <w:rStyle w:val="Hyperlink"/>
@@ -19876,8 +20091,8 @@
         <w:t xml:space="preserve">.</w:t>
       </w:r>
     </w:p>
-    <w:bookmarkEnd w:id="104"/>
-    <w:bookmarkStart w:id="106" w:name="ref-Fielding1997"/>
+    <w:bookmarkEnd w:id="108"/>
+    <w:bookmarkStart w:id="110" w:name="ref-Fielding1997"/>
     <w:p>
       <w:pPr>
         <w:pStyle w:val="Bibliography"/>
@@ -19888,7 +20103,7 @@
       <w:r>
         <w:t xml:space="preserve"> </w:t>
       </w:r>
-      <w:hyperlink r:id="rId105">
+      <w:hyperlink r:id="rId109">
         <w:r>
           <w:rPr>
             <w:rStyle w:val="Hyperlink"/>
@@ -19900,8 +20115,8 @@
         <w:t xml:space="preserve">.</w:t>
       </w:r>
     </w:p>
-    <w:bookmarkEnd w:id="106"/>
-    <w:bookmarkStart w:id="108" w:name="ref-Ford2005"/>
+    <w:bookmarkEnd w:id="110"/>
+    <w:bookmarkStart w:id="112" w:name="ref-Ford2005"/>
     <w:p>
       <w:pPr>
         <w:pStyle w:val="Bibliography"/>
@@ -19917,7 +20132,7 @@
           <w:i/>
           <w:iCs/>
         </w:rPr>
-        <w:t xml:space="preserve">carassius auratus</w:t>
+        <w:t xml:space="preserve">Carassius auratus</w:t>
       </w:r>
       <w:r>
         <w:t xml:space="preserve">. Journal of Thermal Biology 30: 147–152.</w:t>
@@ -19925,7 +20140,7 @@
       <w:r>
         <w:t xml:space="preserve"> </w:t>
       </w:r>
-      <w:hyperlink r:id="rId107">
+      <w:hyperlink r:id="rId111">
         <w:r>
           <w:rPr>
             <w:rStyle w:val="Hyperlink"/>
@@ -19937,8 +20152,8 @@
         <w:t xml:space="preserve">.</w:t>
       </w:r>
     </w:p>
-    <w:bookmarkEnd w:id="108"/>
-    <w:bookmarkStart w:id="110" w:name="ref-Francis2019"/>
+    <w:bookmarkEnd w:id="112"/>
+    <w:bookmarkStart w:id="114" w:name="ref-Francis2019"/>
     <w:p>
       <w:pPr>
         <w:pStyle w:val="Bibliography"/>
@@ -19949,7 +20164,7 @@
       <w:r>
         <w:t xml:space="preserve"> </w:t>
       </w:r>
-      <w:hyperlink r:id="rId109">
+      <w:hyperlink r:id="rId113">
         <w:r>
           <w:rPr>
             <w:rStyle w:val="Hyperlink"/>
@@ -19962,7 +20177,7 @@
             <w:i/>
             <w:iCs/>
           </w:rPr>
-          <w:t xml:space="preserve">ameiurus nebulosus</w:t>
+          <w:t xml:space="preserve">Ameiurus nebulosus</w:t>
         </w:r>
         <w:r>
           <w:rPr>
@@ -19994,32 +20209,68 @@
             <w:i/>
             <w:iCs/>
           </w:rPr>
-          <w:t xml:space="preserve">paranephrops planifrons</w:t>
+          <w:t xml:space="preserve">Paranephrops planifrons</w:t>
         </w:r>
         <w:r>
           <w:rPr>
             <w:rStyle w:val="Hyperlink"/>
           </w:rPr>
-          <w:t xml:space="preserve">) in lake rotoiti</w:t>
+          <w:t xml:space="preserve">) in</w:t>
+        </w:r>
+        <w:r>
+          <w:rPr>
+            <w:rStyle w:val="Hyperlink"/>
+          </w:rPr>
+          <w:t xml:space="preserve"> </w:t>
+        </w:r>
+        <w:r>
+          <w:rPr>
+            <w:rStyle w:val="Hyperlink"/>
+          </w:rPr>
+          <w:t xml:space="preserve">Lake Rotoiti</w:t>
         </w:r>
       </w:hyperlink>
       <w:r>
         <w:t xml:space="preserve">. Master’s thesis, University of Waikato.</w:t>
       </w:r>
     </w:p>
-    <w:bookmarkEnd w:id="110"/>
-    <w:bookmarkStart w:id="112" w:name="ref-Fry1948"/>
+    <w:bookmarkEnd w:id="114"/>
+    <w:bookmarkStart w:id="116" w:name="ref-Froese2006"/>
     <w:p>
       <w:pPr>
         <w:pStyle w:val="Bibliography"/>
       </w:pPr>
       <w:r>
+        <w:t xml:space="preserve">Froese, R., 2006. Cube law, condition factor and weight–length relationships: History, meta-analysis and recommendations. Journal of Applied Ichthyology 22: 241–253.</w:t>
+      </w:r>
+      <w:r>
+        <w:t xml:space="preserve"> </w:t>
+      </w:r>
+      <w:hyperlink r:id="rId115">
+        <w:r>
+          <w:rPr>
+            <w:rStyle w:val="Hyperlink"/>
+          </w:rPr>
+          <w:t xml:space="preserve">https://doi.org/10.1111/j.1439-0426.2006.00805.x</w:t>
+        </w:r>
+      </w:hyperlink>
+      <w:r>
+        <w:t xml:space="preserve">.</w:t>
+      </w:r>
+    </w:p>
+    <w:bookmarkEnd w:id="116"/>
+    <w:bookmarkStart w:id="118" w:name="ref-Fry1948"/>
+    <w:p>
+      <w:pPr>
+        <w:pStyle w:val="Bibliography"/>
+      </w:pPr>
+      <w:r>
         <w:t xml:space="preserve">Fry, F. E. J., &amp; J. S. Hart, 1948. Cruising speed of goldfish in relation to water temperature. Journal of the Fisheries Research Board of Canada 7b: 169–175.</w:t>
       </w:r>
       <w:r>
         <w:t xml:space="preserve"> </w:t>
       </w:r>
-      <w:hyperlink r:id="rId111">
+      <w:hyperlink r:id="rId117">
         <w:r>
           <w:rPr>
             <w:rStyle w:val="Hyperlink"/>
@@ -20031,8 +20282,8 @@
         <w:t xml:space="preserve">.</w:t>
       </w:r>
     </w:p>
-    <w:bookmarkEnd w:id="112"/>
-    <w:bookmarkStart w:id="114" w:name="ref-Grayling2020"/>
+    <w:bookmarkEnd w:id="118"/>
+    <w:bookmarkStart w:id="120" w:name="ref-Grayling2020"/>
     <w:p>
       <w:pPr>
         <w:pStyle w:val="Bibliography"/>
@@ -20043,20 +20294,32 @@
       <w:r>
         <w:t xml:space="preserve"> </w:t>
       </w:r>
-      <w:hyperlink r:id="rId113">
+      <w:hyperlink r:id="rId119">
         <w:r>
           <w:rPr>
             <w:rStyle w:val="Hyperlink"/>
           </w:rPr>
-          <w:t xml:space="preserve">Bay of plenty regional pest management plan 2011–2016 annual report for 2019/2020</w:t>
+          <w:t xml:space="preserve">Bay of Plenty</w:t>
+        </w:r>
+        <w:r>
+          <w:rPr>
+            <w:rStyle w:val="Hyperlink"/>
+          </w:rPr>
+          <w:t xml:space="preserve"> </w:t>
+        </w:r>
+        <w:r>
+          <w:rPr>
+            <w:rStyle w:val="Hyperlink"/>
+          </w:rPr>
+          <w:t xml:space="preserve">regional pest management plan 2011–2016 annual report for 2019/2020</w:t>
         </w:r>
       </w:hyperlink>
       <w:r>
         <w:t xml:space="preserve">. Bay of Plenty Regional Council.</w:t>
       </w:r>
     </w:p>
-    <w:bookmarkEnd w:id="114"/>
-    <w:bookmarkStart w:id="115" w:name="ref-Greenaway1985"/>
+    <w:bookmarkEnd w:id="120"/>
+    <w:bookmarkStart w:id="121" w:name="ref-Greenaway1985"/>
     <w:p>
       <w:pPr>
         <w:pStyle w:val="Bibliography"/>
@@ -20074,14 +20337,26 @@
         <w:t xml:space="preserve">. Biological Reviews 60: 425–454.</w:t>
       </w:r>
     </w:p>
-    <w:bookmarkEnd w:id="115"/>
-    <w:bookmarkStart w:id="116" w:name="ref-Hamilton2005"/>
+    <w:bookmarkEnd w:id="121"/>
+    <w:bookmarkStart w:id="122" w:name="ref-Hamilton2005"/>
     <w:p>
       <w:pPr>
         <w:pStyle w:val="Bibliography"/>
       </w:pPr>
       <w:r>
-        <w:t xml:space="preserve">Hamilton, D., C. McBride, &amp; T. Uraoka, 2005. Lake rotoiti fieldwork and modelling to support considerations of</w:t>
+        <w:t xml:space="preserve">Hamilton, D., C. McBride, &amp; T. Uraoka, 2005.</w:t>
+      </w:r>
+      <w:r>
+        <w:t xml:space="preserve"> </w:t>
+      </w:r>
+      <w:r>
+        <w:t xml:space="preserve">Lake Rotoiti</w:t>
+      </w:r>
+      <w:r>
+        <w:t xml:space="preserve"> </w:t>
+      </w:r>
+      <w:r>
+        <w:t xml:space="preserve">fieldwork and modelling to support considerations of</w:t>
       </w:r>
       <w:r>
         <w:t xml:space="preserve"> </w:t>
@@ -20093,11 +20368,20 @@
         <w:t xml:space="preserve"> </w:t>
       </w:r>
       <w:r>
-        <w:t xml:space="preserve">channel diversion from lake rotoiti. NIWA &amp; University of Waikato.</w:t>
+        <w:t xml:space="preserve">channel diversion from</w:t>
+      </w:r>
+      <w:r>
+        <w:t xml:space="preserve"> </w:t>
+      </w:r>
+      <w:r>
+        <w:t xml:space="preserve">Lake Rotoiti</w:t>
+      </w:r>
+      <w:r>
+        <w:t xml:space="preserve">. NIWA &amp; University of Waikato.</w:t>
       </w:r>
     </w:p>
-    <w:bookmarkEnd w:id="116"/>
-    <w:bookmarkStart w:id="118" w:name="ref-Hammond2006"/>
+    <w:bookmarkEnd w:id="122"/>
+    <w:bookmarkStart w:id="124" w:name="ref-Hammond2006"/>
     <w:p>
       <w:pPr>
         <w:pStyle w:val="Bibliography"/>
@@ -20113,7 +20397,7 @@
           <w:i/>
           <w:iCs/>
         </w:rPr>
-        <w:t xml:space="preserve">paranephrops zealandicus</w:t>
+        <w:t xml:space="preserve">Paranephrops zealandicus</w:t>
       </w:r>
       <w:r>
         <w:t xml:space="preserve">. Aquaculture 251: 271–279.</w:t>
@@ -20121,7 +20405,7 @@
       <w:r>
         <w:t xml:space="preserve"> </w:t>
       </w:r>
-      <w:hyperlink r:id="rId117">
+      <w:hyperlink r:id="rId123">
         <w:r>
           <w:rPr>
             <w:rStyle w:val="Hyperlink"/>
@@ -20133,8 +20417,8 @@
         <w:t xml:space="preserve">.</w:t>
       </w:r>
     </w:p>
-    <w:bookmarkEnd w:id="118"/>
-    <w:bookmarkStart w:id="119" w:name="ref-Harding2009"/>
+    <w:bookmarkEnd w:id="124"/>
+    <w:bookmarkStart w:id="125" w:name="ref-Harding2009"/>
     <w:p>
       <w:pPr>
         <w:pStyle w:val="Bibliography"/>
@@ -20152,8 +20436,8 @@
         <w:t xml:space="preserve">. School of Biological Sciences, University of Canterbury.</w:t>
       </w:r>
     </w:p>
-    <w:bookmarkEnd w:id="119"/>
-    <w:bookmarkStart w:id="121" w:name="ref-Haschenburger2009"/>
+    <w:bookmarkEnd w:id="125"/>
+    <w:bookmarkStart w:id="127" w:name="ref-Haschenburger2009"/>
     <w:p>
       <w:pPr>
         <w:pStyle w:val="Bibliography"/>
@@ -20164,7 +20448,7 @@
       <w:r>
         <w:t xml:space="preserve"> </w:t>
       </w:r>
-      <w:hyperlink r:id="rId120">
+      <w:hyperlink r:id="rId126">
         <w:r>
           <w:rPr>
             <w:rStyle w:val="Hyperlink"/>
@@ -20176,8 +20460,8 @@
         <w:t xml:space="preserve">.</w:t>
       </w:r>
     </w:p>
-    <w:bookmarkEnd w:id="121"/>
-    <w:bookmarkStart w:id="123" w:name="ref-Hesni2009"/>
+    <w:bookmarkEnd w:id="127"/>
+    <w:bookmarkStart w:id="129" w:name="ref-Hesni2009"/>
     <w:p>
       <w:pPr>
         <w:pStyle w:val="Bibliography"/>
@@ -20193,18 +20477,36 @@
           <w:i/>
           <w:iCs/>
         </w:rPr>
-        <w:t xml:space="preserve">astacus leptodactylus</w:t>
-      </w:r>
-      <w:r>
-        <w:t xml:space="preserve"> </w:t>
-      </w:r>
-      <w:r>
-        <w:t xml:space="preserve">eschscholtz, 1823 (decapoda, astacidea). Crustaceana 82: 1495–1507.</w:t>
-      </w:r>
-      <w:r>
-        <w:t xml:space="preserve"> </w:t>
-      </w:r>
-      <w:hyperlink r:id="rId122">
+        <w:t xml:space="preserve">Astacus leptodactylus</w:t>
+      </w:r>
+      <w:r>
+        <w:t xml:space="preserve"> </w:t>
+      </w:r>
+      <w:r>
+        <w:t xml:space="preserve">Eschscholtz</w:t>
+      </w:r>
+      <w:r>
+        <w:t xml:space="preserve">, 1823 (</w:t>
+      </w:r>
+      <w:r>
+        <w:t xml:space="preserve">Decapoda</w:t>
+      </w:r>
+      <w:r>
+        <w:t xml:space="preserve">,</w:t>
+      </w:r>
+      <w:r>
+        <w:t xml:space="preserve"> </w:t>
+      </w:r>
+      <w:r>
+        <w:t xml:space="preserve">Astacidea</w:t>
+      </w:r>
+      <w:r>
+        <w:t xml:space="preserve">). Crustaceana 82: 1495–1507.</w:t>
+      </w:r>
+      <w:r>
+        <w:t xml:space="preserve"> </w:t>
+      </w:r>
+      <w:hyperlink r:id="rId128">
         <w:r>
           <w:rPr>
             <w:rStyle w:val="Hyperlink"/>
@@ -20216,8 +20518,8 @@
         <w:t xml:space="preserve">.</w:t>
       </w:r>
     </w:p>
-    <w:bookmarkEnd w:id="123"/>
-    <w:bookmarkStart w:id="125" w:name="ref-Hessen2004"/>
+    <w:bookmarkEnd w:id="129"/>
+    <w:bookmarkStart w:id="131" w:name="ref-Hessen2004"/>
     <w:p>
       <w:pPr>
         <w:pStyle w:val="Bibliography"/>
@@ -20228,7 +20530,7 @@
       <w:r>
         <w:t xml:space="preserve"> </w:t>
       </w:r>
-      <w:hyperlink r:id="rId124">
+      <w:hyperlink r:id="rId130">
         <w:r>
           <w:rPr>
             <w:rStyle w:val="Hyperlink"/>
@@ -20240,8 +20542,8 @@
         <w:t xml:space="preserve">.</w:t>
       </w:r>
     </w:p>
-    <w:bookmarkEnd w:id="125"/>
-    <w:bookmarkStart w:id="126" w:name="ref-Hiroa1921"/>
+    <w:bookmarkEnd w:id="131"/>
+    <w:bookmarkStart w:id="132" w:name="ref-Hiroa1921"/>
     <w:p>
       <w:pPr>
         <w:pStyle w:val="Bibliography"/>
@@ -20253,11 +20555,20 @@
         <w:t xml:space="preserve">ā</w:t>
       </w:r>
       <w:r>
-        <w:t xml:space="preserve">ori food-supplies of lake rotorua, with methods of obtaining them, and usages and customs appertaining thereto. Transactions and Proceedings of the Royal Society of New Zealand 1868–1961 53: 433–451.</w:t>
+        <w:t xml:space="preserve">ori food-supplies of</w:t>
+      </w:r>
+      <w:r>
+        <w:t xml:space="preserve"> </w:t>
+      </w:r>
+      <w:r>
+        <w:t xml:space="preserve">Lake Rotorua</w:t>
+      </w:r>
+      <w:r>
+        <w:t xml:space="preserve">, with methods of obtaining them, and usages and customs appertaining thereto. Transactions and Proceedings of the Royal Society of New Zealand 1868–1961 53: 433–451.</w:t>
       </w:r>
     </w:p>
-    <w:bookmarkEnd w:id="126"/>
-    <w:bookmarkStart w:id="128" w:name="ref-Hopkins1970"/>
+    <w:bookmarkEnd w:id="132"/>
+    <w:bookmarkStart w:id="134" w:name="ref-Hopkins1970"/>
     <w:p>
       <w:pPr>
         <w:pStyle w:val="Bibliography"/>
@@ -20285,7 +20596,7 @@
           <w:i/>
           <w:iCs/>
         </w:rPr>
-        <w:t xml:space="preserve">paranephrops</w:t>
+        <w:t xml:space="preserve">Paranephrops</w:t>
       </w:r>
       <w:r>
         <w:t xml:space="preserve"> </w:t>
@@ -20320,7 +20631,7 @@
       <w:r>
         <w:t xml:space="preserve"> </w:t>
       </w:r>
-      <w:hyperlink r:id="rId127">
+      <w:hyperlink r:id="rId133">
         <w:r>
           <w:rPr>
             <w:rStyle w:val="Hyperlink"/>
@@ -20332,8 +20643,8 @@
         <w:t xml:space="preserve">.</w:t>
       </w:r>
     </w:p>
-    <w:bookmarkEnd w:id="128"/>
-    <w:bookmarkStart w:id="130" w:name="ref-Jane2021"/>
+    <w:bookmarkEnd w:id="134"/>
+    <w:bookmarkStart w:id="136" w:name="ref-Jane2021"/>
     <w:p>
       <w:pPr>
         <w:pStyle w:val="Bibliography"/>
@@ -20347,7 +20658,7 @@
       <w:r>
         <w:t xml:space="preserve"> </w:t>
       </w:r>
-      <w:hyperlink r:id="rId129">
+      <w:hyperlink r:id="rId135">
         <w:r>
           <w:rPr>
             <w:rStyle w:val="Hyperlink"/>
@@ -20359,8 +20670,8 @@
         <w:t xml:space="preserve">.</w:t>
       </w:r>
     </w:p>
-    <w:bookmarkEnd w:id="130"/>
-    <w:bookmarkStart w:id="131" w:name="ref-Johnsen2008"/>
+    <w:bookmarkEnd w:id="136"/>
+    <w:bookmarkStart w:id="137" w:name="ref-Johnsen2008"/>
     <w:p>
       <w:pPr>
         <w:pStyle w:val="Bibliography"/>
@@ -20369,8 +20680,8 @@
         <w:t xml:space="preserve">Johnsen, S. I., &amp; T. Taugbøl, 2008. Add stones, get crayfish – is it that simple? Freshwater Crayfish 16: 47–50.</w:t>
       </w:r>
     </w:p>
-    <w:bookmarkEnd w:id="131"/>
-    <w:bookmarkStart w:id="133" w:name="ref-Jowett2008"/>
+    <w:bookmarkEnd w:id="137"/>
+    <w:bookmarkStart w:id="139" w:name="ref-Jowett2008"/>
     <w:p>
       <w:pPr>
         <w:pStyle w:val="Bibliography"/>
@@ -20383,7 +20694,7 @@
           <w:i/>
           <w:iCs/>
         </w:rPr>
-        <w:t xml:space="preserve">paranephrops planifrons</w:t>
+        <w:t xml:space="preserve">Paranephrops planifrons</w:t>
       </w:r>
       <w:r>
         <w:t xml:space="preserve">) in</w:t>
@@ -20409,7 +20720,7 @@
       <w:r>
         <w:t xml:space="preserve"> </w:t>
       </w:r>
-      <w:hyperlink r:id="rId132">
+      <w:hyperlink r:id="rId138">
         <w:r>
           <w:rPr>
             <w:rStyle w:val="Hyperlink"/>
@@ -20421,8 +20732,8 @@
         <w:t xml:space="preserve">.</w:t>
       </w:r>
     </w:p>
-    <w:bookmarkEnd w:id="133"/>
-    <w:bookmarkStart w:id="135" w:name="ref-Jowett1990"/>
+    <w:bookmarkEnd w:id="139"/>
+    <w:bookmarkStart w:id="141" w:name="ref-Jowett1990"/>
     <w:p>
       <w:pPr>
         <w:pStyle w:val="Bibliography"/>
@@ -20450,7 +20761,7 @@
           <w:i/>
           <w:iCs/>
         </w:rPr>
-        <w:t xml:space="preserve">deleatidium</w:t>
+        <w:t xml:space="preserve">Deleatidium</w:t>
       </w:r>
       <w:r>
         <w:t xml:space="preserve"> </w:t>
@@ -20461,7 +20772,7 @@
       <w:r>
         <w:t xml:space="preserve"> </w:t>
       </w:r>
-      <w:hyperlink r:id="rId134">
+      <w:hyperlink r:id="rId140">
         <w:r>
           <w:rPr>
             <w:rStyle w:val="Hyperlink"/>
@@ -20473,19 +20784,31 @@
         <w:t xml:space="preserve">.</w:t>
       </w:r>
     </w:p>
-    <w:bookmarkEnd w:id="135"/>
-    <w:bookmarkStart w:id="137" w:name="ref-Kusabs2026"/>
+    <w:bookmarkEnd w:id="141"/>
+    <w:bookmarkStart w:id="143" w:name="ref-Kusabs2026"/>
     <w:p>
       <w:pPr>
         <w:pStyle w:val="Bibliography"/>
       </w:pPr>
       <w:r>
-        <w:t xml:space="preserve">Kusabs, I. A. K., I. C. Duggan, A. C. Bruere, P. Scholes, T. W. Te Kurapa, T. M. Grant, &amp; F. J. Burdon, 2026. Invasive catfish linked to the decline of freshwater crayfish in two aotearoa new zealand lakes. Springer Science; Business Media LLC. Biological Invasions 28:</w:t>
-      </w:r>
-      <w:r>
-        <w:t xml:space="preserve"> </w:t>
-      </w:r>
-      <w:hyperlink r:id="rId136">
+        <w:t xml:space="preserve">Kusabs, I. A. K., I. C. Duggan, A. C. Bruere, P. Scholes, T. W. Te Kurapa, T. M. Grant, &amp; F. J. Burdon, 2026. Invasive catfish linked to the decline of freshwater crayfish in two</w:t>
+      </w:r>
+      <w:r>
+        <w:t xml:space="preserve"> </w:t>
+      </w:r>
+      <w:r>
+        <w:t xml:space="preserve">Aotearoa New Zealand</w:t>
+      </w:r>
+      <w:r>
+        <w:t xml:space="preserve"> </w:t>
+      </w:r>
+      <w:r>
+        <w:t xml:space="preserve">lakes. Biological Invasions 28:</w:t>
+      </w:r>
+      <w:r>
+        <w:t xml:space="preserve"> </w:t>
+      </w:r>
+      <w:hyperlink r:id="rId142">
         <w:r>
           <w:rPr>
             <w:rStyle w:val="Hyperlink"/>
@@ -20497,8 +20820,8 @@
         <w:t xml:space="preserve">.</w:t>
       </w:r>
     </w:p>
-    <w:bookmarkEnd w:id="137"/>
-    <w:bookmarkStart w:id="139" w:name="ref-Kusabs2015a"/>
+    <w:bookmarkEnd w:id="143"/>
+    <w:bookmarkStart w:id="145" w:name="ref-Kusabs2015a"/>
     <w:p>
       <w:pPr>
         <w:pStyle w:val="Bibliography"/>
@@ -20520,7 +20843,7 @@
           <w:i/>
           <w:iCs/>
         </w:rPr>
-        <w:t xml:space="preserve">paranephrops planifrons</w:t>
+        <w:t xml:space="preserve">Paranephrops planifrons</w:t>
       </w:r>
       <w:r>
         <w:t xml:space="preserve">) in</w:t>
@@ -20555,7 +20878,7 @@
       <w:r>
         <w:t xml:space="preserve"> </w:t>
       </w:r>
-      <w:hyperlink r:id="rId138">
+      <w:hyperlink r:id="rId144">
         <w:r>
           <w:rPr>
             <w:rStyle w:val="Hyperlink"/>
@@ -20567,8 +20890,8 @@
         <w:t xml:space="preserve">.</w:t>
       </w:r>
     </w:p>
-    <w:bookmarkEnd w:id="139"/>
-    <w:bookmarkStart w:id="141" w:name="ref-Kusabs2009"/>
+    <w:bookmarkEnd w:id="145"/>
+    <w:bookmarkStart w:id="147" w:name="ref-Kusabs2009"/>
     <w:p>
       <w:pPr>
         <w:pStyle w:val="Bibliography"/>
@@ -20608,16 +20931,25 @@
           <w:i/>
           <w:iCs/>
         </w:rPr>
-        <w:t xml:space="preserve">paranephrops planifrons</w:t>
-      </w:r>
-      <w:r>
-        <w:t xml:space="preserve">) in lake rotoiti, north island,</w:t>
-      </w:r>
-      <w:r>
-        <w:t xml:space="preserve"> </w:t>
-      </w:r>
-      <w:r>
-        <w:t xml:space="preserve">New Zealand</w:t>
+        <w:t xml:space="preserve">Paranephrops planifrons</w:t>
+      </w:r>
+      <w:r>
+        <w:t xml:space="preserve">) in</w:t>
+      </w:r>
+      <w:r>
+        <w:t xml:space="preserve"> </w:t>
+      </w:r>
+      <w:r>
+        <w:t xml:space="preserve">Lake Rotoiti</w:t>
+      </w:r>
+      <w:r>
+        <w:t xml:space="preserve">,</w:t>
+      </w:r>
+      <w:r>
+        <w:t xml:space="preserve"> </w:t>
+      </w:r>
+      <w:r>
+        <w:t xml:space="preserve">North Island, New Zealand</w:t>
       </w:r>
       <w:r>
         <w:t xml:space="preserve">. New Zealand Journal of Marine and Freshwater Research 43: 713–722.</w:t>
@@ -20625,7 +20957,7 @@
       <w:r>
         <w:t xml:space="preserve"> </w:t>
       </w:r>
-      <w:hyperlink r:id="rId140">
+      <w:hyperlink r:id="rId146">
         <w:r>
           <w:rPr>
             <w:rStyle w:val="Hyperlink"/>
@@ -20637,8 +20969,8 @@
         <w:t xml:space="preserve">.</w:t>
       </w:r>
     </w:p>
-    <w:bookmarkEnd w:id="141"/>
-    <w:bookmarkStart w:id="143" w:name="ref-Kusabs2015b"/>
+    <w:bookmarkEnd w:id="147"/>
+    <w:bookmarkStart w:id="149" w:name="ref-Kusabs2015b"/>
     <w:p>
       <w:pPr>
         <w:pStyle w:val="Bibliography"/>
@@ -20660,7 +20992,7 @@
           <w:i/>
           <w:iCs/>
         </w:rPr>
-        <w:t xml:space="preserve">paranephrops planifrons</w:t>
+        <w:t xml:space="preserve">Paranephrops planifrons</w:t>
       </w:r>
       <w:r>
         <w:t xml:space="preserve">) population characteristics in seven</w:t>
@@ -20695,7 +21027,7 @@
       <w:r>
         <w:t xml:space="preserve"> </w:t>
       </w:r>
-      <w:hyperlink r:id="rId142">
+      <w:hyperlink r:id="rId148">
         <w:r>
           <w:rPr>
             <w:rStyle w:val="Hyperlink"/>
@@ -20707,8 +21039,8 @@
         <w:t xml:space="preserve">.</w:t>
       </w:r>
     </w:p>
-    <w:bookmarkEnd w:id="143"/>
-    <w:bookmarkStart w:id="144" w:name="ref-Kutner2005"/>
+    <w:bookmarkEnd w:id="149"/>
+    <w:bookmarkStart w:id="150" w:name="ref-Kutner2005"/>
     <w:p>
       <w:pPr>
         <w:pStyle w:val="Bibliography"/>
@@ -20717,8 +21049,8 @@
         <w:t xml:space="preserve">Kutner, M. H., C. J. Nachtsheim, J. Neter, &amp; W. Li, 2005. Applied linear statistical models. McGraw-Hill Irwin.</w:t>
       </w:r>
     </w:p>
-    <w:bookmarkEnd w:id="144"/>
-    <w:bookmarkStart w:id="146" w:name="ref-LAWA2025"/>
+    <w:bookmarkEnd w:id="150"/>
+    <w:bookmarkStart w:id="152" w:name="ref-LAWA2025"/>
     <w:p>
       <w:pPr>
         <w:pStyle w:val="Bibliography"/>
@@ -20741,7 +21073,7 @@
       <w:r>
         <w:t xml:space="preserve"> </w:t>
       </w:r>
-      <w:hyperlink r:id="rId145">
+      <w:hyperlink r:id="rId151">
         <w:r>
           <w:rPr>
             <w:rStyle w:val="Hyperlink"/>
@@ -20753,8 +21085,8 @@
         <w:t xml:space="preserve">.</w:t>
       </w:r>
     </w:p>
-    <w:bookmarkEnd w:id="146"/>
-    <w:bookmarkStart w:id="148" w:name="ref-Lee2025"/>
+    <w:bookmarkEnd w:id="152"/>
+    <w:bookmarkStart w:id="154" w:name="ref-Lee2025"/>
     <w:p>
       <w:pPr>
         <w:pStyle w:val="Bibliography"/>
@@ -20765,7 +21097,7 @@
       <w:r>
         <w:t xml:space="preserve"> </w:t>
       </w:r>
-      <w:hyperlink r:id="rId147">
+      <w:hyperlink r:id="rId153">
         <w:r>
           <w:rPr>
             <w:rStyle w:val="Hyperlink"/>
@@ -20777,8 +21109,8 @@
         <w:t xml:space="preserve">.</w:t>
       </w:r>
     </w:p>
-    <w:bookmarkEnd w:id="148"/>
-    <w:bookmarkStart w:id="150" w:name="ref-Levin1992"/>
+    <w:bookmarkEnd w:id="154"/>
+    <w:bookmarkStart w:id="156" w:name="ref-Levin1992"/>
     <w:p>
       <w:pPr>
         <w:pStyle w:val="Bibliography"/>
@@ -20801,7 +21133,7 @@
       <w:r>
         <w:t xml:space="preserve"> </w:t>
       </w:r>
-      <w:hyperlink r:id="rId149">
+      <w:hyperlink r:id="rId155">
         <w:r>
           <w:rPr>
             <w:rStyle w:val="Hyperlink"/>
@@ -20813,8 +21145,8 @@
         <w:t xml:space="preserve">.</w:t>
       </w:r>
     </w:p>
-    <w:bookmarkEnd w:id="150"/>
-    <w:bookmarkStart w:id="152" w:name="ref-Lishawa2023"/>
+    <w:bookmarkEnd w:id="156"/>
+    <w:bookmarkStart w:id="158" w:name="ref-Lishawa2023"/>
     <w:p>
       <w:pPr>
         <w:pStyle w:val="Bibliography"/>
@@ -20830,7 +21162,7 @@
           <w:i/>
           <w:iCs/>
         </w:rPr>
-        <w:t xml:space="preserve">typha</w:t>
+        <w:t xml:space="preserve">Typha</w:t>
       </w:r>
       <w:r>
         <w:t xml:space="preserve">-invaded</w:t>
@@ -20850,7 +21182,7 @@
       <w:r>
         <w:t xml:space="preserve"> </w:t>
       </w:r>
-      <w:hyperlink r:id="rId151">
+      <w:hyperlink r:id="rId157">
         <w:r>
           <w:rPr>
             <w:rStyle w:val="Hyperlink"/>
@@ -20862,8 +21194,8 @@
         <w:t xml:space="preserve">.</w:t>
       </w:r>
     </w:p>
-    <w:bookmarkEnd w:id="152"/>
-    <w:bookmarkStart w:id="154" w:name="ref-Meerhoff2022"/>
+    <w:bookmarkEnd w:id="158"/>
+    <w:bookmarkStart w:id="160" w:name="ref-Meerhoff2022"/>
     <w:p>
       <w:pPr>
         <w:pStyle w:val="Bibliography"/>
@@ -20874,7 +21206,7 @@
       <w:r>
         <w:t xml:space="preserve"> </w:t>
       </w:r>
-      <w:hyperlink r:id="rId153">
+      <w:hyperlink r:id="rId159">
         <w:r>
           <w:rPr>
             <w:rStyle w:val="Hyperlink"/>
@@ -20886,8 +21218,8 @@
         <w:t xml:space="preserve">.</w:t>
       </w:r>
     </w:p>
-    <w:bookmarkEnd w:id="154"/>
-    <w:bookmarkStart w:id="156" w:name="ref-Momot1995"/>
+    <w:bookmarkEnd w:id="160"/>
+    <w:bookmarkStart w:id="162" w:name="ref-Momot1995"/>
     <w:p>
       <w:pPr>
         <w:pStyle w:val="Bibliography"/>
@@ -20898,7 +21230,7 @@
       <w:r>
         <w:t xml:space="preserve"> </w:t>
       </w:r>
-      <w:hyperlink r:id="rId155">
+      <w:hyperlink r:id="rId161">
         <w:r>
           <w:rPr>
             <w:rStyle w:val="Hyperlink"/>
@@ -20910,8 +21242,8 @@
         <w:t xml:space="preserve">.</w:t>
       </w:r>
     </w:p>
-    <w:bookmarkEnd w:id="156"/>
-    <w:bookmarkStart w:id="158" w:name="ref-Nystrom2006"/>
+    <w:bookmarkEnd w:id="162"/>
+    <w:bookmarkStart w:id="164" w:name="ref-Nystrom2006"/>
     <w:p>
       <w:pPr>
         <w:pStyle w:val="Bibliography"/>
@@ -20922,7 +21254,7 @@
       <w:r>
         <w:t xml:space="preserve"> </w:t>
       </w:r>
-      <w:hyperlink r:id="rId157">
+      <w:hyperlink r:id="rId163">
         <w:r>
           <w:rPr>
             <w:rStyle w:val="Hyperlink"/>
@@ -20934,8 +21266,8 @@
         <w:t xml:space="preserve">.</w:t>
       </w:r>
     </w:p>
-    <w:bookmarkEnd w:id="158"/>
-    <w:bookmarkStart w:id="160" w:name="ref-Olsson2006"/>
+    <w:bookmarkEnd w:id="164"/>
+    <w:bookmarkStart w:id="166" w:name="ref-Olsson2006"/>
     <w:p>
       <w:pPr>
         <w:pStyle w:val="Bibliography"/>
@@ -20958,7 +21290,7 @@
       <w:r>
         <w:t xml:space="preserve"> </w:t>
       </w:r>
-      <w:hyperlink r:id="rId159">
+      <w:hyperlink r:id="rId165">
         <w:r>
           <w:rPr>
             <w:rStyle w:val="Hyperlink"/>
@@ -20970,19 +21302,39 @@
         <w:t xml:space="preserve">.</w:t>
       </w:r>
     </w:p>
-    <w:bookmarkEnd w:id="160"/>
-    <w:bookmarkStart w:id="162" w:name="ref-Parkyn2004"/>
+    <w:bookmarkEnd w:id="166"/>
+    <w:bookmarkStart w:id="167" w:name="ref-Parkyn2002"/>
     <w:p>
       <w:pPr>
         <w:pStyle w:val="Bibliography"/>
       </w:pPr>
       <w:r>
+        <w:t xml:space="preserve">Parkyn, S. M., &amp; K. J. Collier, 2002. Differentiating the effects of diet and temperature on juvenile crayfish (</w:t>
+      </w:r>
+      <w:r>
+        <w:rPr>
+          <w:i/>
+          <w:iCs/>
+        </w:rPr>
+        <w:t xml:space="preserve">Paranephrops planifrons</w:t>
+      </w:r>
+      <w:r>
+        <w:t xml:space="preserve">) growth: Leaf detritus versus invertebrate food sources at two diurnally varying temperatures. Freshwater Crayfish 13: 371–382.</w:t>
+      </w:r>
+    </w:p>
+    <w:bookmarkEnd w:id="167"/>
+    <w:bookmarkStart w:id="169" w:name="ref-Parkyn2004"/>
+    <w:p>
+      <w:pPr>
+        <w:pStyle w:val="Bibliography"/>
+      </w:pPr>
+      <w:r>
         <w:t xml:space="preserve">Parkyn, S. M., &amp; K. J. Collier, 2004. Interaction of press and pulse disturbance on crayfish populations: Flood impacts in pasture and forest streams. Hydrobiologia 527: 113–124.</w:t>
       </w:r>
       <w:r>
         <w:t xml:space="preserve"> </w:t>
       </w:r>
-      <w:hyperlink r:id="rId161">
+      <w:hyperlink r:id="rId168">
         <w:r>
           <w:rPr>
             <w:rStyle w:val="Hyperlink"/>
@@ -20994,20 +21346,20 @@
         <w:t xml:space="preserve">.</w:t>
       </w:r>
     </w:p>
-    <w:bookmarkEnd w:id="162"/>
-    <w:bookmarkStart w:id="164" w:name="ref-Parkyn2001"/>
+    <w:bookmarkEnd w:id="169"/>
+    <w:bookmarkStart w:id="171" w:name="ref-Parkyn2001"/>
     <w:p>
       <w:pPr>
         <w:pStyle w:val="Bibliography"/>
       </w:pPr>
       <w:r>
-        <w:t xml:space="preserve">Parkyn, S. M., K. J. Collier, &amp; B. J. Hicks, 2001. New</w:t>
-      </w:r>
-      <w:r>
-        <w:t xml:space="preserve"> </w:t>
-      </w:r>
-      <w:r>
-        <w:t xml:space="preserve">Zealand</w:t>
+        <w:t xml:space="preserve">Parkyn, S. M., K. J. Collier, &amp; B. J. Hicks, 2001.</w:t>
+      </w:r>
+      <w:r>
+        <w:t xml:space="preserve"> </w:t>
+      </w:r>
+      <w:r>
+        <w:t xml:space="preserve">New Zealand</w:t>
       </w:r>
       <w:r>
         <w:t xml:space="preserve"> </w:t>
@@ -21018,7 +21370,7 @@
       <w:r>
         <w:t xml:space="preserve"> </w:t>
       </w:r>
-      <w:hyperlink r:id="rId163">
+      <w:hyperlink r:id="rId170">
         <w:r>
           <w:rPr>
             <w:rStyle w:val="Hyperlink"/>
@@ -21030,8 +21382,8 @@
         <w:t xml:space="preserve">.</w:t>
       </w:r>
     </w:p>
-    <w:bookmarkEnd w:id="164"/>
-    <w:bookmarkStart w:id="166" w:name="ref-Parkyn2009"/>
+    <w:bookmarkEnd w:id="171"/>
+    <w:bookmarkStart w:id="173" w:name="ref-Parkyn2009"/>
     <w:p>
       <w:pPr>
         <w:pStyle w:val="Bibliography"/>
@@ -21044,7 +21396,7 @@
           <w:i/>
           <w:iCs/>
         </w:rPr>
-        <w:t xml:space="preserve">paranephrops planifrons</w:t>
+        <w:t xml:space="preserve">Paranephrops planifrons</w:t>
       </w:r>
       <w:r>
         <w:t xml:space="preserve">) habitat in a forested stream. New Zealand Journal of Marine and Freshwater Research 43: 689–700.</w:t>
@@ -21052,7 +21404,7 @@
       <w:r>
         <w:t xml:space="preserve"> </w:t>
       </w:r>
-      <w:hyperlink r:id="rId165">
+      <w:hyperlink r:id="rId172">
         <w:r>
           <w:rPr>
             <w:rStyle w:val="Hyperlink"/>
@@ -21064,8 +21416,8 @@
         <w:t xml:space="preserve">.</w:t>
       </w:r>
     </w:p>
-    <w:bookmarkEnd w:id="166"/>
-    <w:bookmarkStart w:id="167" w:name="ref-Quinn2002"/>
+    <w:bookmarkEnd w:id="173"/>
+    <w:bookmarkStart w:id="174" w:name="ref-Quinn2002"/>
     <w:p>
       <w:pPr>
         <w:pStyle w:val="Bibliography"/>
@@ -21074,8 +21426,8 @@
         <w:t xml:space="preserve">Quinn, G. P., &amp; M. J. Keough, 2002. Experimental design and data analysis for biologists. Cambridge University Press.</w:t>
       </w:r>
     </w:p>
-    <w:bookmarkEnd w:id="167"/>
-    <w:bookmarkStart w:id="169" w:name="ref-Quinn1990"/>
+    <w:bookmarkEnd w:id="174"/>
+    <w:bookmarkStart w:id="176" w:name="ref-Quinn1990"/>
     <w:p>
       <w:pPr>
         <w:pStyle w:val="Bibliography"/>
@@ -21098,7 +21450,7 @@
       <w:r>
         <w:t xml:space="preserve"> </w:t>
       </w:r>
-      <w:hyperlink r:id="rId168">
+      <w:hyperlink r:id="rId175">
         <w:r>
           <w:rPr>
             <w:rStyle w:val="Hyperlink"/>
@@ -21110,8 +21462,8 @@
         <w:t xml:space="preserve">.</w:t>
       </w:r>
     </w:p>
-    <w:bookmarkEnd w:id="169"/>
-    <w:bookmarkStart w:id="171" w:name="ref-RCoreTeam2025"/>
+    <w:bookmarkEnd w:id="176"/>
+    <w:bookmarkStart w:id="178" w:name="ref-RCoreTeam2025"/>
     <w:p>
       <w:pPr>
         <w:pStyle w:val="Bibliography"/>
@@ -21122,7 +21474,7 @@
       <w:r>
         <w:t xml:space="preserve"> </w:t>
       </w:r>
-      <w:hyperlink r:id="rId170">
+      <w:hyperlink r:id="rId177">
         <w:r>
           <w:rPr>
             <w:rStyle w:val="Hyperlink"/>
@@ -21140,8 +21492,8 @@
         <w:t xml:space="preserve">. R Foundation for Statistical Computing, Vienna, Austria.</w:t>
       </w:r>
     </w:p>
-    <w:bookmarkEnd w:id="171"/>
-    <w:bookmarkStart w:id="173" w:name="ref-Richman2015"/>
+    <w:bookmarkEnd w:id="178"/>
+    <w:bookmarkStart w:id="180" w:name="ref-Richman2015"/>
     <w:p>
       <w:pPr>
         <w:pStyle w:val="Bibliography"/>
@@ -21170,7 +21522,7 @@
       <w:r>
         <w:t xml:space="preserve"> </w:t>
       </w:r>
-      <w:hyperlink r:id="rId172">
+      <w:hyperlink r:id="rId179">
         <w:r>
           <w:rPr>
             <w:rStyle w:val="Hyperlink"/>
@@ -21182,8 +21534,8 @@
         <w:t xml:space="preserve">.</w:t>
       </w:r>
     </w:p>
-    <w:bookmarkEnd w:id="173"/>
-    <w:bookmarkStart w:id="175" w:name="ref-Rosewarne2013"/>
+    <w:bookmarkEnd w:id="180"/>
+    <w:bookmarkStart w:id="182" w:name="ref-Rosewarne2013"/>
     <w:p>
       <w:pPr>
         <w:pStyle w:val="Bibliography"/>
@@ -21196,7 +21548,7 @@
           <w:i/>
           <w:iCs/>
         </w:rPr>
-        <w:t xml:space="preserve">pacifastacus leniusculus</w:t>
+        <w:t xml:space="preserve">Pacifastacus leniusculus</w:t>
       </w:r>
       <w:r>
         <w:t xml:space="preserve">) movements at a flow gauging weir. Management of Biological Invasions 4: 273–282.</w:t>
@@ -21204,7 +21556,7 @@
       <w:r>
         <w:t xml:space="preserve"> </w:t>
       </w:r>
-      <w:hyperlink r:id="rId174">
+      <w:hyperlink r:id="rId181">
         <w:r>
           <w:rPr>
             <w:rStyle w:val="Hyperlink"/>
@@ -21216,14 +21568,23 @@
         <w:t xml:space="preserve">.</w:t>
       </w:r>
     </w:p>
-    <w:bookmarkEnd w:id="175"/>
-    <w:bookmarkStart w:id="177" w:name="ref-Rowe1993"/>
+    <w:bookmarkEnd w:id="182"/>
+    <w:bookmarkStart w:id="184" w:name="ref-Rowe1993"/>
     <w:p>
       <w:pPr>
         <w:pStyle w:val="Bibliography"/>
       </w:pPr>
       <w:r>
-        <w:t xml:space="preserve">Rowe, D. K., 1993. Identification of fish responsible for five layers of echoes recorded by high-frequency (200 kHz) echosounding in lake rotoiti,</w:t>
+        <w:t xml:space="preserve">Rowe, D. K., 1993. Identification of fish responsible for five layers of echoes recorded by high-frequency (200 kHz) echosounding in</w:t>
+      </w:r>
+      <w:r>
+        <w:t xml:space="preserve"> </w:t>
+      </w:r>
+      <w:r>
+        <w:t xml:space="preserve">Lake Rotoiti</w:t>
+      </w:r>
+      <w:r>
+        <w:t xml:space="preserve">,</w:t>
       </w:r>
       <w:r>
         <w:t xml:space="preserve"> </w:t>
@@ -21237,7 +21598,7 @@
       <w:r>
         <w:t xml:space="preserve"> </w:t>
       </w:r>
-      <w:hyperlink r:id="rId176">
+      <w:hyperlink r:id="rId183">
         <w:r>
           <w:rPr>
             <w:rStyle w:val="Hyperlink"/>
@@ -21249,8 +21610,8 @@
         <w:t xml:space="preserve">.</w:t>
       </w:r>
     </w:p>
-    <w:bookmarkEnd w:id="177"/>
-    <w:bookmarkStart w:id="179" w:name="ref-Schoen2015"/>
+    <w:bookmarkEnd w:id="184"/>
+    <w:bookmarkStart w:id="186" w:name="ref-Schoen2015"/>
     <w:p>
       <w:pPr>
         <w:pStyle w:val="Bibliography"/>
@@ -21266,7 +21627,7 @@
           <w:i/>
           <w:iCs/>
         </w:rPr>
-        <w:t xml:space="preserve">mysis diluviana</w:t>
+        <w:t xml:space="preserve">Mysis diluviana</w:t>
       </w:r>
       <w:r>
         <w:t xml:space="preserve"> </w:t>
@@ -21277,7 +21638,7 @@
       <w:r>
         <w:t xml:space="preserve"> </w:t>
       </w:r>
-      <w:hyperlink r:id="rId178">
+      <w:hyperlink r:id="rId185">
         <w:r>
           <w:rPr>
             <w:rStyle w:val="Hyperlink"/>
@@ -21289,8 +21650,8 @@
         <w:t xml:space="preserve">.</w:t>
       </w:r>
     </w:p>
-    <w:bookmarkEnd w:id="179"/>
-    <w:bookmarkStart w:id="181" w:name="ref-Schrank2019"/>
+    <w:bookmarkEnd w:id="186"/>
+    <w:bookmarkStart w:id="188" w:name="ref-Schrank2019"/>
     <w:p>
       <w:pPr>
         <w:pStyle w:val="Bibliography"/>
@@ -21313,7 +21674,7 @@
       <w:r>
         <w:t xml:space="preserve"> </w:t>
       </w:r>
-      <w:hyperlink r:id="rId180">
+      <w:hyperlink r:id="rId187">
         <w:r>
           <w:rPr>
             <w:rStyle w:val="Hyperlink"/>
@@ -21325,13 +21686,33 @@
         <w:t xml:space="preserve">.</w:t>
       </w:r>
     </w:p>
-    <w:bookmarkEnd w:id="181"/>
-    <w:bookmarkStart w:id="183" w:name="ref-Shono2008"/>
+    <w:bookmarkEnd w:id="188"/>
+    <w:bookmarkStart w:id="189" w:name="ref-Shave1994"/>
     <w:p>
       <w:pPr>
         <w:pStyle w:val="Bibliography"/>
       </w:pPr>
       <w:r>
+        <w:t xml:space="preserve">Shave, C. R., C. R. Townsend, &amp; T. A. Crowl, 1994. Anti-predator behaviours of a freshwater crayfish (</w:t>
+      </w:r>
+      <w:r>
+        <w:rPr>
+          <w:i/>
+          <w:iCs/>
+        </w:rPr>
+        <w:t xml:space="preserve">Paranephrops zealandicus</w:t>
+      </w:r>
+      <w:r>
+        <w:t xml:space="preserve">) to a native and an introduced predator. New Zealand Journal of Ecology 18: 1–10.</w:t>
+      </w:r>
+    </w:p>
+    <w:bookmarkEnd w:id="189"/>
+    <w:bookmarkStart w:id="191" w:name="ref-Shono2008"/>
+    <w:p>
+      <w:pPr>
+        <w:pStyle w:val="Bibliography"/>
+      </w:pPr>
+      <w:r>
         <w:t xml:space="preserve">Shono, H., 2008. Application of the</w:t>
       </w:r>
       <w:r>
@@ -21361,7 +21742,7 @@
       <w:r>
         <w:t xml:space="preserve"> </w:t>
       </w:r>
-      <w:hyperlink r:id="rId182">
+      <w:hyperlink r:id="rId190">
         <w:r>
           <w:rPr>
             <w:rStyle w:val="Hyperlink"/>
@@ -21373,19 +21754,68 @@
         <w:t xml:space="preserve">.</w:t>
       </w:r>
     </w:p>
-    <w:bookmarkEnd w:id="183"/>
-    <w:bookmarkStart w:id="185" w:name="ref-Statzner2003"/>
+    <w:bookmarkEnd w:id="191"/>
+    <w:bookmarkStart w:id="193" w:name="ref-Smith1996"/>
     <w:p>
       <w:pPr>
         <w:pStyle w:val="Bibliography"/>
       </w:pPr>
       <w:r>
+        <w:t xml:space="preserve">Smith, G. R. T., M. A. Learner, F. M. Slater, &amp; J. Foster, 1996. Habitat features important for the conservation of the native crayfish</w:t>
+      </w:r>
+      <w:r>
+        <w:t xml:space="preserve"> </w:t>
+      </w:r>
+      <w:r>
+        <w:rPr>
+          <w:i/>
+          <w:iCs/>
+        </w:rPr>
+        <w:t xml:space="preserve">Austropotamobius pallipes</w:t>
+      </w:r>
+      <w:r>
+        <w:t xml:space="preserve"> </w:t>
+      </w:r>
+      <w:r>
+        <w:t xml:space="preserve">in</w:t>
+      </w:r>
+      <w:r>
+        <w:t xml:space="preserve"> </w:t>
+      </w:r>
+      <w:r>
+        <w:t xml:space="preserve">Britain</w:t>
+      </w:r>
+      <w:r>
+        <w:t xml:space="preserve">. Biological Conservation 75: 239–246.</w:t>
+      </w:r>
+      <w:r>
+        <w:t xml:space="preserve"> </w:t>
+      </w:r>
+      <w:hyperlink r:id="rId192">
+        <w:r>
+          <w:rPr>
+            <w:rStyle w:val="Hyperlink"/>
+          </w:rPr>
+          <w:t xml:space="preserve">https://doi.org/10.1016/0006-3207(95)00073-9</w:t>
+        </w:r>
+      </w:hyperlink>
+      <w:r>
+        <w:t xml:space="preserve">.</w:t>
+      </w:r>
+    </w:p>
+    <w:bookmarkEnd w:id="193"/>
+    <w:bookmarkStart w:id="195" w:name="ref-Statzner2003"/>
+    <w:p>
+      <w:pPr>
+        <w:pStyle w:val="Bibliography"/>
+      </w:pPr>
+      <w:r>
         <w:t xml:space="preserve">Statzner, B., O. Peltret, &amp; S. Tomanova, 2003. Crayfish as geomorphic agents and ecosystem engineers: Effect of a biomass gradient on baseflow and flood-induced transport of gravel and sand in experimental streams. Freshwater Biology 48: 147–163.</w:t>
       </w:r>
       <w:r>
         <w:t xml:space="preserve"> </w:t>
       </w:r>
-      <w:hyperlink r:id="rId184">
+      <w:hyperlink r:id="rId194">
         <w:r>
           <w:rPr>
             <w:rStyle w:val="Hyperlink"/>
@@ -21397,8 +21827,8 @@
         <w:t xml:space="preserve">.</w:t>
       </w:r>
     </w:p>
-    <w:bookmarkEnd w:id="185"/>
-    <w:bookmarkStart w:id="187" w:name="ref-Stevens2004"/>
+    <w:bookmarkEnd w:id="195"/>
+    <w:bookmarkStart w:id="197" w:name="ref-Stevens2004"/>
     <w:p>
       <w:pPr>
         <w:pStyle w:val="Bibliography"/>
@@ -21409,7 +21839,7 @@
       <w:r>
         <w:t xml:space="preserve"> </w:t>
       </w:r>
-      <w:hyperlink r:id="rId186">
+      <w:hyperlink r:id="rId196">
         <w:r>
           <w:rPr>
             <w:rStyle w:val="Hyperlink"/>
@@ -21421,8 +21851,8 @@
         <w:t xml:space="preserve">.</w:t>
       </w:r>
     </w:p>
-    <w:bookmarkEnd w:id="187"/>
-    <w:bookmarkStart w:id="189" w:name="ref-Strayer2010"/>
+    <w:bookmarkEnd w:id="197"/>
+    <w:bookmarkStart w:id="199" w:name="ref-Strayer2010"/>
     <w:p>
       <w:pPr>
         <w:pStyle w:val="Bibliography"/>
@@ -21433,7 +21863,7 @@
       <w:r>
         <w:t xml:space="preserve"> </w:t>
       </w:r>
-      <w:hyperlink r:id="rId188">
+      <w:hyperlink r:id="rId198">
         <w:r>
           <w:rPr>
             <w:rStyle w:val="Hyperlink"/>
@@ -21445,8 +21875,8 @@
         <w:t xml:space="preserve">.</w:t>
       </w:r>
     </w:p>
-    <w:bookmarkEnd w:id="189"/>
-    <w:bookmarkStart w:id="191" w:name="ref-Taylor2019"/>
+    <w:bookmarkEnd w:id="199"/>
+    <w:bookmarkStart w:id="201" w:name="ref-Taylor2019"/>
     <w:p>
       <w:pPr>
         <w:pStyle w:val="Bibliography"/>
@@ -21466,7 +21896,7 @@
       <w:r>
         <w:t xml:space="preserve"> </w:t>
       </w:r>
-      <w:hyperlink r:id="rId190">
+      <w:hyperlink r:id="rId200">
         <w:r>
           <w:rPr>
             <w:rStyle w:val="Hyperlink"/>
@@ -21478,8 +21908,8 @@
         <w:t xml:space="preserve">.</w:t>
       </w:r>
     </w:p>
-    <w:bookmarkEnd w:id="191"/>
-    <w:bookmarkStart w:id="193" w:name="ref-Usio2000"/>
+    <w:bookmarkEnd w:id="201"/>
+    <w:bookmarkStart w:id="203" w:name="ref-Usio2000"/>
     <w:p>
       <w:pPr>
         <w:pStyle w:val="Bibliography"/>
@@ -21504,7 +21934,7 @@
           <w:i/>
           <w:iCs/>
         </w:rPr>
-        <w:t xml:space="preserve">paranephrops zealandicus</w:t>
+        <w:t xml:space="preserve">Paranephrops zealandicus</w:t>
       </w:r>
       <w:r>
         <w:t xml:space="preserve">) in relation to stream physico-chemistry, predatory fish, and invertebrate prey. New Zealand Journal of Marine and Freshwater Research 34: 557–567.</w:t>
@@ -21512,7 +21942,7 @@
       <w:r>
         <w:t xml:space="preserve"> </w:t>
       </w:r>
-      <w:hyperlink r:id="rId192">
+      <w:hyperlink r:id="rId202">
         <w:r>
           <w:rPr>
             <w:rStyle w:val="Hyperlink"/>
@@ -21524,8 +21954,8 @@
         <w:t xml:space="preserve">.</w:t>
       </w:r>
     </w:p>
-    <w:bookmarkEnd w:id="193"/>
-    <w:bookmarkStart w:id="195" w:name="ref-Usio2004"/>
+    <w:bookmarkEnd w:id="203"/>
+    <w:bookmarkStart w:id="205" w:name="ref-Usio2004"/>
     <w:p>
       <w:pPr>
         <w:pStyle w:val="Bibliography"/>
@@ -21536,7 +21966,7 @@
       <w:r>
         <w:t xml:space="preserve"> </w:t>
       </w:r>
-      <w:hyperlink r:id="rId194">
+      <w:hyperlink r:id="rId204">
         <w:r>
           <w:rPr>
             <w:rStyle w:val="Hyperlink"/>
@@ -21548,13 +21978,46 @@
         <w:t xml:space="preserve">.</w:t>
       </w:r>
     </w:p>
-    <w:bookmarkEnd w:id="195"/>
-    <w:bookmarkStart w:id="197" w:name="ref-Vincent1984"/>
+    <w:bookmarkEnd w:id="205"/>
+    <w:bookmarkStart w:id="207" w:name="ref-Vedia2017"/>
     <w:p>
       <w:pPr>
         <w:pStyle w:val="Bibliography"/>
       </w:pPr>
       <w:r>
+        <w:t xml:space="preserve">Vedia, I., D. Galicia, E. Baquero, J. Oscoz, &amp; R. Miranda, 2017. Environmental factors influencing the distribution and abundance of the introduced signal crayfish in the north of</w:t>
+      </w:r>
+      <w:r>
+        <w:t xml:space="preserve"> </w:t>
+      </w:r>
+      <w:r>
+        <w:t xml:space="preserve">Iberian Peninsula</w:t>
+      </w:r>
+      <w:r>
+        <w:t xml:space="preserve">. Marine and Freshwater Research 68: 900–908.</w:t>
+      </w:r>
+      <w:r>
+        <w:t xml:space="preserve"> </w:t>
+      </w:r>
+      <w:hyperlink r:id="rId206">
+        <w:r>
+          <w:rPr>
+            <w:rStyle w:val="Hyperlink"/>
+          </w:rPr>
+          <w:t xml:space="preserve">https://doi.org/10.1071/MF16020</w:t>
+        </w:r>
+      </w:hyperlink>
+      <w:r>
+        <w:t xml:space="preserve">.</w:t>
+      </w:r>
+    </w:p>
+    <w:bookmarkEnd w:id="207"/>
+    <w:bookmarkStart w:id="209" w:name="ref-Vincent1984"/>
+    <w:p>
+      <w:pPr>
+        <w:pStyle w:val="Bibliography"/>
+      </w:pPr>
+      <w:r>
         <w:t xml:space="preserve">Vincent, W. F., M. M. Gibbs, &amp; S. J. Dryden, 1984. Accelerated eutrophication in a</w:t>
       </w:r>
       <w:r>
@@ -21590,7 +22053,7 @@
       <w:r>
         <w:t xml:space="preserve"> </w:t>
       </w:r>
-      <w:hyperlink r:id="rId196">
+      <w:hyperlink r:id="rId208">
         <w:r>
           <w:rPr>
             <w:rStyle w:val="Hyperlink"/>
@@ -21602,8 +22065,8 @@
         <w:t xml:space="preserve">.</w:t>
       </w:r>
     </w:p>
-    <w:bookmarkEnd w:id="197"/>
-    <w:bookmarkStart w:id="199" w:name="ref-vonWesternhagen2010"/>
+    <w:bookmarkEnd w:id="209"/>
+    <w:bookmarkStart w:id="211" w:name="ref-vonWesternhagen2010"/>
     <w:p>
       <w:pPr>
         <w:pStyle w:val="Bibliography"/>
@@ -21623,7 +22086,7 @@
       <w:r>
         <w:t xml:space="preserve"> </w:t>
       </w:r>
-      <w:hyperlink r:id="rId198">
+      <w:hyperlink r:id="rId210">
         <w:r>
           <w:rPr>
             <w:rStyle w:val="Hyperlink"/>
@@ -21635,8 +22098,8 @@
         <w:t xml:space="preserve">.</w:t>
       </w:r>
     </w:p>
-    <w:bookmarkEnd w:id="199"/>
-    <w:bookmarkStart w:id="200" w:name="ref-Wetzel2001"/>
+    <w:bookmarkEnd w:id="211"/>
+    <w:bookmarkStart w:id="212" w:name="ref-Wetzel2001"/>
     <w:p>
       <w:pPr>
         <w:pStyle w:val="Bibliography"/>
@@ -21645,8 +22108,8 @@
         <w:t xml:space="preserve">Wetzel, R. G., 2001. Limnology: Lake and river ecosystems. Gulf Professional Publishing.</w:t>
       </w:r>
     </w:p>
-    <w:bookmarkEnd w:id="200"/>
-    <w:bookmarkStart w:id="202" w:name="ref-White2003"/>
+    <w:bookmarkEnd w:id="212"/>
+    <w:bookmarkStart w:id="214" w:name="ref-White2003"/>
     <w:p>
       <w:pPr>
         <w:pStyle w:val="Bibliography"/>
@@ -21657,7 +22120,7 @@
       <w:r>
         <w:t xml:space="preserve"> </w:t>
       </w:r>
-      <w:hyperlink r:id="rId201">
+      <w:hyperlink r:id="rId213">
         <w:r>
           <w:rPr>
             <w:rStyle w:val="Hyperlink"/>
@@ -21669,8 +22132,8 @@
         <w:t xml:space="preserve">.</w:t>
       </w:r>
     </w:p>
-    <w:bookmarkEnd w:id="202"/>
-    <w:bookmarkStart w:id="204" w:name="ref-Wood2004"/>
+    <w:bookmarkEnd w:id="214"/>
+    <w:bookmarkStart w:id="216" w:name="ref-Wood2004"/>
     <w:p>
       <w:pPr>
         <w:pStyle w:val="Bibliography"/>
@@ -21681,7 +22144,7 @@
       <w:r>
         <w:t xml:space="preserve"> </w:t>
       </w:r>
-      <w:hyperlink r:id="rId203">
+      <w:hyperlink r:id="rId215">
         <w:r>
           <w:rPr>
             <w:rStyle w:val="Hyperlink"/>
@@ -21693,8 +22156,8 @@
         <w:t xml:space="preserve">.</w:t>
       </w:r>
     </w:p>
-    <w:bookmarkEnd w:id="204"/>
-    <w:bookmarkStart w:id="206" w:name="ref-Wood2017"/>
+    <w:bookmarkEnd w:id="216"/>
+    <w:bookmarkStart w:id="218" w:name="ref-Wood2017"/>
     <w:p>
       <w:pPr>
         <w:pStyle w:val="Bibliography"/>
@@ -21705,7 +22168,7 @@
       <w:r>
         <w:t xml:space="preserve"> </w:t>
       </w:r>
-      <w:hyperlink r:id="rId205">
+      <w:hyperlink r:id="rId217">
         <w:r>
           <w:rPr>
             <w:rStyle w:val="Hyperlink"/>
@@ -21729,8 +22192,8 @@
         <w:t xml:space="preserve">. Chapman; Hall/CRC.</w:t>
       </w:r>
     </w:p>
-    <w:bookmarkEnd w:id="206"/>
-    <w:bookmarkStart w:id="208" w:name="ref-Woolway2021"/>
+    <w:bookmarkEnd w:id="218"/>
+    <w:bookmarkStart w:id="220" w:name="ref-Woolway2021"/>
     <w:p>
       <w:pPr>
         <w:pStyle w:val="Bibliography"/>
@@ -21744,7 +22207,7 @@
       <w:r>
         <w:t xml:space="preserve"> </w:t>
       </w:r>
-      <w:hyperlink r:id="rId207">
+      <w:hyperlink r:id="rId219">
         <w:r>
           <w:rPr>
             <w:rStyle w:val="Hyperlink"/>
@@ -21756,8 +22219,8 @@
         <w:t xml:space="preserve">.</w:t>
       </w:r>
     </w:p>
-    <w:bookmarkEnd w:id="208"/>
-    <w:bookmarkStart w:id="210" w:name="ref-Zhang2024"/>
+    <w:bookmarkEnd w:id="220"/>
+    <w:bookmarkStart w:id="222" w:name="ref-Zhang2024"/>
     <w:p>
       <w:pPr>
         <w:pStyle w:val="Bibliography"/>
@@ -21768,7 +22231,7 @@
       <w:r>
         <w:t xml:space="preserve"> </w:t>
       </w:r>
-      <w:hyperlink r:id="rId209">
+      <w:hyperlink r:id="rId221">
         <w:r>
           <w:rPr>
             <w:rStyle w:val="Hyperlink"/>
@@ -21780,8 +22243,8 @@
         <w:t xml:space="preserve">.</w:t>
       </w:r>
     </w:p>
-    <w:bookmarkEnd w:id="210"/>
-    <w:bookmarkStart w:id="212" w:name="ref-Zuur2009"/>
+    <w:bookmarkEnd w:id="222"/>
+    <w:bookmarkStart w:id="224" w:name="ref-Zuur2009"/>
     <w:p>
       <w:pPr>
         <w:pStyle w:val="Bibliography"/>
@@ -21792,7 +22255,7 @@
       <w:r>
         <w:t xml:space="preserve"> </w:t>
       </w:r>
-      <w:hyperlink r:id="rId211">
+      <w:hyperlink r:id="rId223">
         <w:r>
           <w:rPr>
             <w:rStyle w:val="Hyperlink"/>
@@ -21816,9 +22279,9 @@
         <w:t xml:space="preserve">. Springer.</w:t>
       </w:r>
     </w:p>
-    <w:bookmarkEnd w:id="212"/>
-    <w:bookmarkEnd w:id="213"/>
-    <w:bookmarkEnd w:id="214"/>
+    <w:bookmarkEnd w:id="224"/>
+    <w:bookmarkEnd w:id="225"/>
+    <w:bookmarkEnd w:id="226"/>
     <w:sectPr>
       <w:footerReference r:id="rId7" w:type="default"/>
       <w:pgSz w:h="16838" w:w="11906"/>

</xml_diff>

<commit_message>
updated to R 4.6.1
</commit_message>
<xml_diff>
--- a/docs/index.docx
+++ b/docs/index.docx
@@ -3301,14 +3301,9 @@
       <w:r>
         <w:t xml:space="preserve">. Missing kōura weights due to failure of scale (n = 81) were estimated using a log₁₀–log₁₀ length–weight regression fitted to individuals with both measurements (n = 240), following standard approaches for weight length relationships in aquatic organisms (</w:t>
       </w:r>
-      <w:hyperlink w:anchor="fig-length-weight">
-        <w:r>
-          <w:rPr>
-            <w:rStyle w:val="Hyperlink"/>
-          </w:rPr>
-          <w:t xml:space="preserve">Figure 6</w:t>
-        </w:r>
-      </w:hyperlink>
+      <w:r>
+        <w:t xml:space="preserve">(Fig. S1)</w:t>
+      </w:r>
       <w:r>
         <w:t xml:space="preserve">)</w:t>
       </w:r>
@@ -4017,14 +4012,9 @@
       <w:r>
         <w:t xml:space="preserve">The five lakes differed substantially in environmental and biotic characteristics (</w:t>
       </w:r>
-      <w:hyperlink w:anchor="tbl-an-env-fish-summary">
-        <w:r>
-          <w:rPr>
-            <w:rStyle w:val="Hyperlink"/>
-          </w:rPr>
-          <w:t xml:space="preserve">Table 3</w:t>
-        </w:r>
-      </w:hyperlink>
+      <w:r>
+        <w:t xml:space="preserve">(Table S1)</w:t>
+      </w:r>
       <w:r>
         <w:t xml:space="preserve">). Physical habitat structure varied among lakes, with differences in substrate index, nearshore slope, and littoral vegetation cover. Emergent macrophytes were absent from Lake Rotorua but present in the other lakes, particularly Ōkāreka, while submerged macrophyte cover at the shore was rare in Rotorua and Rotoiti but more extensive in Rotoehu and Rotomā. Water chemistry also differed markedly among lakes. Surface water temperatures were highest in Rotorua and lowest in Rotomā and Ōkāreka, while pH ranged from circum-neutral conditions in Rotorua to more alkaline conditions in Rotoehu and Rotoiti. Specific conductivity showed strong contrasts, being highest in Rotoehu and lowest in Ōkāreka. Dissolved oxygen concentrations in the littoral zone varied less among lakes but were generally lowest in Rotorua. Fish populations differed between lakes, reflecting invasion history. Catfish were detected only in Lakes Rotorua and Rotoiti, whereas goldfish occurred in all lakes but were most abundant in Rotoehu. Common bullies were found in every survey location. Trout were found sporadically in Rotorua, Rotoiti and Ōkāreka and kōaro were only caught from Ōkāreka.</w:t>
       </w:r>
@@ -5072,7 +5062,7 @@
     </w:p>
     <w:bookmarkEnd w:id="55"/>
     <w:bookmarkEnd w:id="56"/>
-    <w:bookmarkStart w:id="62" w:name="acknowledgements"/>
+    <w:bookmarkStart w:id="210" w:name="acknowledgements"/>
     <w:p>
       <w:pPr>
         <w:pStyle w:val="Heading2"/>
@@ -5179,263 +5169,8 @@
       </w:r>
     </w:p>
     <w:bookmarkEnd w:id="61"/>
-    <w:bookmarkEnd w:id="62"/>
-    <w:bookmarkStart w:id="223" w:name="chapter-3-supplementary-information"/>
-    <w:p>
-      <w:pPr>
-        <w:pStyle w:val="Heading2"/>
-      </w:pPr>
-      <w:r>
-        <w:t xml:space="preserve">Chapter 3 — Supplementary information</w:t>
-      </w:r>
-    </w:p>
-    <w:tbl>
-      <w:tblPr>
-        <w:tblStyle w:val="Table"/>
-        <w:tblW w:type="pct" w:w="5000"/>
-        <w:tblLayout w:type="fixed"/>
-        <w:tblLook w:firstRow="0" w:lastRow="0" w:firstColumn="0" w:lastColumn="0" w:noHBand="0" w:noVBand="0" w:val="0000"/>
-      </w:tblPr>
-      <w:tblGrid>
-        <w:gridCol w:w="7920"/>
-      </w:tblGrid>
-      <w:tr>
-        <w:tc>
-          <w:tcPr/>
-          <w:bookmarkStart w:id="66" w:name="fig-length-weight"/>
-          <w:p>
-            <w:pPr>
-              <w:pStyle w:val="Compact"/>
-              <w:jc w:val="center"/>
-            </w:pPr>
-            <w:r>
-              <w:drawing>
-                <wp:inline>
-                  <wp:extent cx="5727700" cy="4091214"/>
-                  <wp:effectExtent b="0" l="0" r="0" t="0"/>
-                  <wp:docPr descr="" title="" id="64" name="Picture"/>
-                  <a:graphic>
-                    <a:graphicData uri="http://schemas.openxmlformats.org/drawingml/2006/picture">
-                      <pic:pic>
-                        <pic:nvPicPr>
-                          <pic:cNvPr descr="outputs/fig-length-weight.png" id="65" name="Picture"/>
-                          <pic:cNvPicPr>
-                            <a:picLocks noChangeArrowheads="1" noChangeAspect="1"/>
-                          </pic:cNvPicPr>
-                        </pic:nvPicPr>
-                        <pic:blipFill>
-                          <a:blip r:embed="rId63"/>
-                          <a:stretch>
-                            <a:fillRect/>
-                          </a:stretch>
-                        </pic:blipFill>
-                        <pic:spPr bwMode="auto">
-                          <a:xfrm>
-                            <a:off x="0" y="0"/>
-                            <a:ext cx="5727700" cy="4091214"/>
-                          </a:xfrm>
-                          <a:prstGeom prst="rect">
-                            <a:avLst/>
-                          </a:prstGeom>
-                          <a:noFill/>
-                          <a:ln w="9525">
-                            <a:noFill/>
-                            <a:headEnd/>
-                            <a:tailEnd/>
-                          </a:ln>
-                        </pic:spPr>
-                      </pic:pic>
-                    </a:graphicData>
-                  </a:graphic>
-                </wp:inline>
-              </w:drawing>
-            </w:r>
-          </w:p>
-          <w:p>
-            <w:pPr>
-              <w:jc w:val="center"/>
-            </w:pPr>
-            <w:pPr>
-              <w:jc w:val="left"/>
-              <w:spacing w:before="200"/>
-              <w:pStyle w:val="ImageCaption"/>
-            </w:pPr>
-            <w:r>
-              <w:t xml:space="preserve">Figure 6: Length–weight relationship used to estimate missing kōura weights. Observed (measured) and model-predicted body weights are shown in relation to orbital carapace length (OCL). The log₁₀–log₁₀ regression was fitted to individuals with both length and weight measurements (n = 240) and used to estimate missing weights (n = 81). Predicted values were back-transformed using a lognormal bias correction factor. The fitted regression equation is shown on the plot.</w:t>
-            </w:r>
-          </w:p>
-          <w:bookmarkEnd w:id="66"/>
-        </w:tc>
-      </w:tr>
-    </w:tbl>
-    <w:p>
-      <w:pPr>
-        <w:pStyle w:val="BodyText"/>
-      </w:pPr>
-      <w:r>
-        <w:t xml:space="preserve"> </w:t>
-      </w:r>
-    </w:p>
-    <w:tbl>
-      <w:tblPr>
-        <w:tblStyle w:val="Table"/>
-        <w:tblW w:type="pct" w:w="5000"/>
-        <w:tblLayout w:type="fixed"/>
-        <w:tblLook w:firstRow="0" w:lastRow="0" w:firstColumn="0" w:lastColumn="0" w:noHBand="0" w:noVBand="0" w:val="0000"/>
-      </w:tblPr>
-      <w:tblGrid>
-        <w:gridCol w:w="7920"/>
-      </w:tblGrid>
-      <w:tr>
-        <w:tc>
-          <w:tcPr/>
-          <w:bookmarkStart w:id="70" w:name="fig-raw-data-all-predictors"/>
-          <w:p>
-            <w:pPr>
-              <w:pStyle w:val="Compact"/>
-              <w:jc w:val="center"/>
-            </w:pPr>
-            <w:r>
-              <w:drawing>
-                <wp:inline>
-                  <wp:extent cx="4572000" cy="9144000"/>
-                  <wp:effectExtent b="0" l="0" r="0" t="0"/>
-                  <wp:docPr descr="" title="" id="68" name="Picture"/>
-                  <a:graphic>
-                    <a:graphicData uri="http://schemas.openxmlformats.org/drawingml/2006/picture">
-                      <pic:pic>
-                        <pic:nvPicPr>
-                          <pic:cNvPr descr="outputs/fig-raw-data-all-predictors.png" id="69" name="Picture"/>
-                          <pic:cNvPicPr>
-                            <a:picLocks noChangeArrowheads="1" noChangeAspect="1"/>
-                          </pic:cNvPicPr>
-                        </pic:nvPicPr>
-                        <pic:blipFill>
-                          <a:blip r:embed="rId67"/>
-                          <a:stretch>
-                            <a:fillRect/>
-                          </a:stretch>
-                        </pic:blipFill>
-                        <pic:spPr bwMode="auto">
-                          <a:xfrm>
-                            <a:off x="0" y="0"/>
-                            <a:ext cx="4572000" cy="9144000"/>
-                          </a:xfrm>
-                          <a:prstGeom prst="rect">
-                            <a:avLst/>
-                          </a:prstGeom>
-                          <a:noFill/>
-                          <a:ln w="9525">
-                            <a:noFill/>
-                            <a:headEnd/>
-                            <a:tailEnd/>
-                          </a:ln>
-                        </pic:spPr>
-                      </pic:pic>
-                    </a:graphicData>
-                  </a:graphic>
-                </wp:inline>
-              </w:drawing>
-            </w:r>
-          </w:p>
-          <w:p>
-            <w:pPr>
-              <w:jc w:val="center"/>
-            </w:pPr>
-            <w:pPr>
-              <w:jc w:val="left"/>
-              <w:spacing w:before="200"/>
-              <w:pStyle w:val="ImageCaption"/>
-            </w:pPr>
-            <w:r>
-              <w:t xml:space="preserve">Figure 7: Raw relationships between all environmental predictors examined and kōura occurrence, CPUE, and BPUE across all 60 surveyed littoral sites. Each panel shows observed values at individual sites (n = 60 for occurrence; n = 33 for CPUE and BPUE). Points are jittered slightly for occurrence data to reduce overplotting. Predictors highlighted in bold were retained in final GAM models.</w:t>
-            </w:r>
-          </w:p>
-          <w:bookmarkEnd w:id="70"/>
-        </w:tc>
-      </w:tr>
-    </w:tbl>
-    <w:p/>
-    <w:tbl>
-      <w:tblPr>
-        <w:tblStyle w:val="Table"/>
-        <w:tblW w:type="pct" w:w="5000"/>
-        <w:tblLayout w:type="fixed"/>
-        <w:tblLook w:firstRow="0" w:lastRow="0" w:firstColumn="0" w:lastColumn="0" w:noHBand="0" w:noVBand="0" w:val="0000"/>
-      </w:tblPr>
-      <w:tblGrid>
-        <w:gridCol w:w="7920"/>
-      </w:tblGrid>
-      <w:tr>
-        <w:tc>
-          <w:tcPr/>
-          <w:bookmarkStart w:id="74" w:name="tbl-an-env-fish-summary"/>
-          <w:p>
-            <w:pPr>
-              <w:jc w:val="center"/>
-            </w:pPr>
-            <w:pPr>
-              <w:jc w:val="left"/>
-              <w:spacing w:before="200"/>
-              <w:pStyle w:val="ImageCaption"/>
-            </w:pPr>
-            <w:r>
-              <w:t xml:space="preserve">Table 3: Distribution of environmental and biotic variables measured at littoral sampling sites across five Te Arawa lakes in the Rotorua region of Aotearoa New Zealand.</w:t>
-            </w:r>
-          </w:p>
-          <w:p>
-            <w:pPr>
-              <w:jc w:val="center"/>
-            </w:pPr>
-            <w:r>
-              <w:drawing>
-                <wp:inline>
-                  <wp:extent cx="5727700" cy="9371216"/>
-                  <wp:effectExtent b="0" l="0" r="0" t="0"/>
-                  <wp:docPr descr="" title="" id="72" name="Picture"/>
-                  <a:graphic>
-                    <a:graphicData uri="http://schemas.openxmlformats.org/drawingml/2006/picture">
-                      <pic:pic>
-                        <pic:nvPicPr>
-                          <pic:cNvPr descr="index_files/figure-docx/tbl-an-env-fish-summary-1.png" id="73" name="Picture"/>
-                          <pic:cNvPicPr>
-                            <a:picLocks noChangeArrowheads="1" noChangeAspect="1"/>
-                          </pic:cNvPicPr>
-                        </pic:nvPicPr>
-                        <pic:blipFill>
-                          <a:blip r:embed="rId71"/>
-                          <a:stretch>
-                            <a:fillRect/>
-                          </a:stretch>
-                        </pic:blipFill>
-                        <pic:spPr bwMode="auto">
-                          <a:xfrm>
-                            <a:off x="0" y="0"/>
-                            <a:ext cx="5727700" cy="9371216"/>
-                          </a:xfrm>
-                          <a:prstGeom prst="rect">
-                            <a:avLst/>
-                          </a:prstGeom>
-                          <a:noFill/>
-                          <a:ln w="9525">
-                            <a:noFill/>
-                            <a:headEnd/>
-                            <a:tailEnd/>
-                          </a:ln>
-                        </pic:spPr>
-                      </pic:pic>
-                    </a:graphicData>
-                  </a:graphic>
-                </wp:inline>
-              </w:drawing>
-            </w:r>
-          </w:p>
-          <w:bookmarkEnd w:id="74"/>
-        </w:tc>
-      </w:tr>
-    </w:tbl>
-    <w:bookmarkStart w:id="222" w:name="refs"/>
-    <w:bookmarkStart w:id="76" w:name="ref-Albertson2018"/>
+    <w:bookmarkStart w:id="209" w:name="refs"/>
+    <w:bookmarkStart w:id="63" w:name="ref-Albertson2018"/>
     <w:p>
       <w:pPr>
         <w:pStyle w:val="Bibliography"/>
@@ -5446,7 +5181,7 @@
       <w:r>
         <w:t xml:space="preserve"> </w:t>
       </w:r>
-      <w:hyperlink r:id="rId75">
+      <w:hyperlink r:id="rId62">
         <w:r>
           <w:rPr>
             <w:rStyle w:val="Hyperlink"/>
@@ -5458,8 +5193,8 @@
         <w:t xml:space="preserve">.</w:t>
       </w:r>
     </w:p>
-    <w:bookmarkEnd w:id="76"/>
-    <w:bookmarkStart w:id="78" w:name="ref-Angilletta2004"/>
+    <w:bookmarkEnd w:id="63"/>
+    <w:bookmarkStart w:id="65" w:name="ref-Angilletta2004"/>
     <w:p>
       <w:pPr>
         <w:pStyle w:val="Bibliography"/>
@@ -5470,7 +5205,7 @@
       <w:r>
         <w:t xml:space="preserve"> </w:t>
       </w:r>
-      <w:hyperlink r:id="rId77">
+      <w:hyperlink r:id="rId64">
         <w:r>
           <w:rPr>
             <w:rStyle w:val="Hyperlink"/>
@@ -5482,8 +5217,8 @@
         <w:t xml:space="preserve">.</w:t>
       </w:r>
     </w:p>
-    <w:bookmarkEnd w:id="78"/>
-    <w:bookmarkStart w:id="80" w:name="ref-Barnes1996"/>
+    <w:bookmarkEnd w:id="65"/>
+    <w:bookmarkStart w:id="67" w:name="ref-Barnes1996"/>
     <w:p>
       <w:pPr>
         <w:pStyle w:val="Bibliography"/>
@@ -5494,7 +5229,7 @@
       <w:r>
         <w:t xml:space="preserve"> </w:t>
       </w:r>
-      <w:hyperlink r:id="rId79">
+      <w:hyperlink r:id="rId66">
         <w:r>
           <w:rPr>
             <w:rStyle w:val="Hyperlink"/>
@@ -5532,8 +5267,8 @@
         <w:t xml:space="preserve">. Master of Science thesis, University of Waikato.</w:t>
       </w:r>
     </w:p>
-    <w:bookmarkEnd w:id="80"/>
-    <w:bookmarkStart w:id="81" w:name="ref-Barnes2003"/>
+    <w:bookmarkEnd w:id="67"/>
+    <w:bookmarkStart w:id="68" w:name="ref-Barnes2003"/>
     <w:p>
       <w:pPr>
         <w:pStyle w:val="Bibliography"/>
@@ -5588,8 +5323,8 @@
         <w:t xml:space="preserve">. Department of Conservation.</w:t>
       </w:r>
     </w:p>
-    <w:bookmarkEnd w:id="81"/>
-    <w:bookmarkStart w:id="83" w:name="ref-Bolker2009"/>
+    <w:bookmarkEnd w:id="68"/>
+    <w:bookmarkStart w:id="70" w:name="ref-Bolker2009"/>
     <w:p>
       <w:pPr>
         <w:pStyle w:val="Bibliography"/>
@@ -5600,7 +5335,7 @@
       <w:r>
         <w:t xml:space="preserve"> </w:t>
       </w:r>
-      <w:hyperlink r:id="rId82">
+      <w:hyperlink r:id="rId69">
         <w:r>
           <w:rPr>
             <w:rStyle w:val="Hyperlink"/>
@@ -5612,8 +5347,8 @@
         <w:t xml:space="preserve">.</w:t>
       </w:r>
     </w:p>
-    <w:bookmarkEnd w:id="83"/>
-    <w:bookmarkStart w:id="85" w:name="ref-Brooks2017"/>
+    <w:bookmarkEnd w:id="70"/>
+    <w:bookmarkStart w:id="72" w:name="ref-Brooks2017"/>
     <w:p>
       <w:pPr>
         <w:pStyle w:val="Bibliography"/>
@@ -5624,7 +5359,7 @@
       <w:r>
         <w:t xml:space="preserve"> </w:t>
       </w:r>
-      <w:hyperlink r:id="rId84">
+      <w:hyperlink r:id="rId71">
         <w:r>
           <w:rPr>
             <w:rStyle w:val="Hyperlink"/>
@@ -5636,8 +5371,8 @@
         <w:t xml:space="preserve">.</w:t>
       </w:r>
     </w:p>
-    <w:bookmarkEnd w:id="85"/>
-    <w:bookmarkStart w:id="87" w:name="ref-Broughton2017"/>
+    <w:bookmarkEnd w:id="72"/>
+    <w:bookmarkStart w:id="74" w:name="ref-Broughton2017"/>
     <w:p>
       <w:pPr>
         <w:pStyle w:val="Bibliography"/>
@@ -5661,7 +5396,7 @@
       <w:r>
         <w:t xml:space="preserve"> </w:t>
       </w:r>
-      <w:hyperlink r:id="rId86">
+      <w:hyperlink r:id="rId73">
         <w:r>
           <w:rPr>
             <w:rStyle w:val="Hyperlink"/>
@@ -5673,8 +5408,8 @@
         <w:t xml:space="preserve">.</w:t>
       </w:r>
     </w:p>
-    <w:bookmarkEnd w:id="87"/>
-    <w:bookmarkStart w:id="89" w:name="ref-Bunch2010"/>
+    <w:bookmarkEnd w:id="74"/>
+    <w:bookmarkStart w:id="76" w:name="ref-Bunch2010"/>
     <w:p>
       <w:pPr>
         <w:pStyle w:val="Bibliography"/>
@@ -5697,7 +5432,7 @@
       <w:r>
         <w:t xml:space="preserve"> </w:t>
       </w:r>
-      <w:hyperlink r:id="rId88">
+      <w:hyperlink r:id="rId75">
         <w:r>
           <w:rPr>
             <w:rStyle w:val="Hyperlink"/>
@@ -5709,8 +5444,8 @@
         <w:t xml:space="preserve">.</w:t>
       </w:r>
     </w:p>
-    <w:bookmarkEnd w:id="89"/>
-    <w:bookmarkStart w:id="91" w:name="ref-Capinha2013"/>
+    <w:bookmarkEnd w:id="76"/>
+    <w:bookmarkStart w:id="78" w:name="ref-Capinha2013"/>
     <w:p>
       <w:pPr>
         <w:pStyle w:val="Bibliography"/>
@@ -5733,7 +5468,7 @@
       <w:r>
         <w:t xml:space="preserve"> </w:t>
       </w:r>
-      <w:hyperlink r:id="rId90">
+      <w:hyperlink r:id="rId77">
         <w:r>
           <w:rPr>
             <w:rStyle w:val="Hyperlink"/>
@@ -5745,8 +5480,8 @@
         <w:t xml:space="preserve">.</w:t>
       </w:r>
     </w:p>
-    <w:bookmarkEnd w:id="91"/>
-    <w:bookmarkStart w:id="93" w:name="ref-Chambers1987"/>
+    <w:bookmarkEnd w:id="78"/>
+    <w:bookmarkStart w:id="80" w:name="ref-Chambers1987"/>
     <w:p>
       <w:pPr>
         <w:pStyle w:val="Bibliography"/>
@@ -5757,7 +5492,7 @@
       <w:r>
         <w:t xml:space="preserve"> </w:t>
       </w:r>
-      <w:hyperlink r:id="rId92">
+      <w:hyperlink r:id="rId79">
         <w:r>
           <w:rPr>
             <w:rStyle w:val="Hyperlink"/>
@@ -5769,8 +5504,8 @@
         <w:t xml:space="preserve">.</w:t>
       </w:r>
     </w:p>
-    <w:bookmarkEnd w:id="93"/>
-    <w:bookmarkStart w:id="95" w:name="ref-Coffey1988"/>
+    <w:bookmarkEnd w:id="80"/>
+    <w:bookmarkStart w:id="82" w:name="ref-Coffey1988"/>
     <w:p>
       <w:pPr>
         <w:pStyle w:val="Bibliography"/>
@@ -5809,7 +5544,7 @@
       <w:r>
         <w:t xml:space="preserve"> </w:t>
       </w:r>
-      <w:hyperlink r:id="rId94">
+      <w:hyperlink r:id="rId81">
         <w:r>
           <w:rPr>
             <w:rStyle w:val="Hyperlink"/>
@@ -5821,8 +5556,8 @@
         <w:t xml:space="preserve">.</w:t>
       </w:r>
     </w:p>
-    <w:bookmarkEnd w:id="95"/>
-    <w:bookmarkStart w:id="96" w:name="ref-Collier1997"/>
+    <w:bookmarkEnd w:id="82"/>
+    <w:bookmarkStart w:id="83" w:name="ref-Collier1997"/>
     <w:p>
       <w:pPr>
         <w:pStyle w:val="Bibliography"/>
@@ -5831,8 +5566,8 @@
         <w:t xml:space="preserve">Collier, K. J., S. M. Parkyn, &amp; C. F. Rabeni, 1997. Koura: A keystone species. Water and Atmosphere 5: 18–20.</w:t>
       </w:r>
     </w:p>
-    <w:bookmarkEnd w:id="96"/>
-    <w:bookmarkStart w:id="98" w:name="ref-Creed2004"/>
+    <w:bookmarkEnd w:id="83"/>
+    <w:bookmarkStart w:id="85" w:name="ref-Creed2004"/>
     <w:p>
       <w:pPr>
         <w:pStyle w:val="Bibliography"/>
@@ -5843,7 +5578,7 @@
       <w:r>
         <w:t xml:space="preserve"> </w:t>
       </w:r>
-      <w:hyperlink r:id="rId97">
+      <w:hyperlink r:id="rId84">
         <w:r>
           <w:rPr>
             <w:rStyle w:val="Hyperlink"/>
@@ -5855,8 +5590,8 @@
         <w:t xml:space="preserve">.</w:t>
       </w:r>
     </w:p>
-    <w:bookmarkEnd w:id="98"/>
-    <w:bookmarkStart w:id="100" w:name="ref-Danilovic2022"/>
+    <w:bookmarkEnd w:id="85"/>
+    <w:bookmarkStart w:id="87" w:name="ref-Danilovic2022"/>
     <w:p>
       <w:pPr>
         <w:pStyle w:val="Bibliography"/>
@@ -5876,7 +5611,7 @@
       <w:r>
         <w:t xml:space="preserve"> </w:t>
       </w:r>
-      <w:hyperlink r:id="rId99">
+      <w:hyperlink r:id="rId86">
         <w:r>
           <w:rPr>
             <w:rStyle w:val="Hyperlink"/>
@@ -5888,8 +5623,8 @@
         <w:t xml:space="preserve">.</w:t>
       </w:r>
     </w:p>
-    <w:bookmarkEnd w:id="100"/>
-    <w:bookmarkStart w:id="102" w:name="ref-Dedual2002"/>
+    <w:bookmarkEnd w:id="87"/>
+    <w:bookmarkStart w:id="89" w:name="ref-Dedual2002"/>
     <w:p>
       <w:pPr>
         <w:pStyle w:val="Bibliography"/>
@@ -5946,7 +5681,7 @@
       <w:r>
         <w:t xml:space="preserve"> </w:t>
       </w:r>
-      <w:hyperlink r:id="rId101">
+      <w:hyperlink r:id="rId88">
         <w:r>
           <w:rPr>
             <w:rStyle w:val="Hyperlink"/>
@@ -5958,8 +5693,8 @@
         <w:t xml:space="preserve">.</w:t>
       </w:r>
     </w:p>
-    <w:bookmarkEnd w:id="102"/>
-    <w:bookmarkStart w:id="103" w:name="ref-Devcich1979"/>
+    <w:bookmarkEnd w:id="89"/>
+    <w:bookmarkStart w:id="90" w:name="ref-Devcich1979"/>
     <w:p>
       <w:pPr>
         <w:pStyle w:val="Bibliography"/>
@@ -6023,8 +5758,8 @@
         <w:t xml:space="preserve">. PhD thesis, University of Waikato.</w:t>
       </w:r>
     </w:p>
-    <w:bookmarkEnd w:id="103"/>
-    <w:bookmarkStart w:id="105" w:name="ref-Dumelle2023"/>
+    <w:bookmarkEnd w:id="90"/>
+    <w:bookmarkStart w:id="92" w:name="ref-Dumelle2023"/>
     <w:p>
       <w:pPr>
         <w:pStyle w:val="Bibliography"/>
@@ -6044,7 +5779,7 @@
       <w:r>
         <w:t xml:space="preserve"> </w:t>
       </w:r>
-      <w:hyperlink r:id="rId104">
+      <w:hyperlink r:id="rId91">
         <w:r>
           <w:rPr>
             <w:rStyle w:val="Hyperlink"/>
@@ -6056,8 +5791,8 @@
         <w:t xml:space="preserve">.</w:t>
       </w:r>
     </w:p>
-    <w:bookmarkEnd w:id="105"/>
-    <w:bookmarkStart w:id="107" w:name="ref-Fielding1997"/>
+    <w:bookmarkEnd w:id="92"/>
+    <w:bookmarkStart w:id="94" w:name="ref-Fielding1997"/>
     <w:p>
       <w:pPr>
         <w:pStyle w:val="Bibliography"/>
@@ -6068,7 +5803,7 @@
       <w:r>
         <w:t xml:space="preserve"> </w:t>
       </w:r>
-      <w:hyperlink r:id="rId106">
+      <w:hyperlink r:id="rId93">
         <w:r>
           <w:rPr>
             <w:rStyle w:val="Hyperlink"/>
@@ -6080,8 +5815,8 @@
         <w:t xml:space="preserve">.</w:t>
       </w:r>
     </w:p>
-    <w:bookmarkEnd w:id="107"/>
-    <w:bookmarkStart w:id="109" w:name="ref-Ford2005"/>
+    <w:bookmarkEnd w:id="94"/>
+    <w:bookmarkStart w:id="96" w:name="ref-Ford2005"/>
     <w:p>
       <w:pPr>
         <w:pStyle w:val="Bibliography"/>
@@ -6105,7 +5840,7 @@
       <w:r>
         <w:t xml:space="preserve"> </w:t>
       </w:r>
-      <w:hyperlink r:id="rId108">
+      <w:hyperlink r:id="rId95">
         <w:r>
           <w:rPr>
             <w:rStyle w:val="Hyperlink"/>
@@ -6117,8 +5852,8 @@
         <w:t xml:space="preserve">.</w:t>
       </w:r>
     </w:p>
-    <w:bookmarkEnd w:id="109"/>
-    <w:bookmarkStart w:id="111" w:name="ref-Francis2019"/>
+    <w:bookmarkEnd w:id="96"/>
+    <w:bookmarkStart w:id="98" w:name="ref-Francis2019"/>
     <w:p>
       <w:pPr>
         <w:pStyle w:val="Bibliography"/>
@@ -6129,7 +5864,7 @@
       <w:r>
         <w:t xml:space="preserve"> </w:t>
       </w:r>
-      <w:hyperlink r:id="rId110">
+      <w:hyperlink r:id="rId97">
         <w:r>
           <w:rPr>
             <w:rStyle w:val="Hyperlink"/>
@@ -6199,8 +5934,8 @@
         <w:t xml:space="preserve">. Master’s thesis, University of Waikato.</w:t>
       </w:r>
     </w:p>
-    <w:bookmarkEnd w:id="111"/>
-    <w:bookmarkStart w:id="113" w:name="ref-Froese2006"/>
+    <w:bookmarkEnd w:id="98"/>
+    <w:bookmarkStart w:id="100" w:name="ref-Froese2006"/>
     <w:p>
       <w:pPr>
         <w:pStyle w:val="Bibliography"/>
@@ -6211,7 +5946,7 @@
       <w:r>
         <w:t xml:space="preserve"> </w:t>
       </w:r>
-      <w:hyperlink r:id="rId112">
+      <w:hyperlink r:id="rId99">
         <w:r>
           <w:rPr>
             <w:rStyle w:val="Hyperlink"/>
@@ -6223,8 +5958,8 @@
         <w:t xml:space="preserve">.</w:t>
       </w:r>
     </w:p>
-    <w:bookmarkEnd w:id="113"/>
-    <w:bookmarkStart w:id="115" w:name="ref-Fry1948"/>
+    <w:bookmarkEnd w:id="100"/>
+    <w:bookmarkStart w:id="102" w:name="ref-Fry1948"/>
     <w:p>
       <w:pPr>
         <w:pStyle w:val="Bibliography"/>
@@ -6235,7 +5970,7 @@
       <w:r>
         <w:t xml:space="preserve"> </w:t>
       </w:r>
-      <w:hyperlink r:id="rId114">
+      <w:hyperlink r:id="rId101">
         <w:r>
           <w:rPr>
             <w:rStyle w:val="Hyperlink"/>
@@ -6247,8 +5982,8 @@
         <w:t xml:space="preserve">.</w:t>
       </w:r>
     </w:p>
-    <w:bookmarkEnd w:id="115"/>
-    <w:bookmarkStart w:id="117" w:name="ref-Grayling2020"/>
+    <w:bookmarkEnd w:id="102"/>
+    <w:bookmarkStart w:id="104" w:name="ref-Grayling2020"/>
     <w:p>
       <w:pPr>
         <w:pStyle w:val="Bibliography"/>
@@ -6259,7 +5994,7 @@
       <w:r>
         <w:t xml:space="preserve"> </w:t>
       </w:r>
-      <w:hyperlink r:id="rId116">
+      <w:hyperlink r:id="rId103">
         <w:r>
           <w:rPr>
             <w:rStyle w:val="Hyperlink"/>
@@ -6283,8 +6018,8 @@
         <w:t xml:space="preserve">. Bay of Plenty Regional Council.</w:t>
       </w:r>
     </w:p>
-    <w:bookmarkEnd w:id="117"/>
-    <w:bookmarkStart w:id="118" w:name="ref-Greenaway1985"/>
+    <w:bookmarkEnd w:id="104"/>
+    <w:bookmarkStart w:id="105" w:name="ref-Greenaway1985"/>
     <w:p>
       <w:pPr>
         <w:pStyle w:val="Bibliography"/>
@@ -6302,8 +6037,8 @@
         <w:t xml:space="preserve">. Biological Reviews 60: 425–454.</w:t>
       </w:r>
     </w:p>
-    <w:bookmarkEnd w:id="118"/>
-    <w:bookmarkStart w:id="119" w:name="ref-Hamilton2005"/>
+    <w:bookmarkEnd w:id="105"/>
+    <w:bookmarkStart w:id="106" w:name="ref-Hamilton2005"/>
     <w:p>
       <w:pPr>
         <w:pStyle w:val="Bibliography"/>
@@ -6345,8 +6080,8 @@
         <w:t xml:space="preserve">. NIWA &amp; University of Waikato.</w:t>
       </w:r>
     </w:p>
-    <w:bookmarkEnd w:id="119"/>
-    <w:bookmarkStart w:id="121" w:name="ref-Hammond2006"/>
+    <w:bookmarkEnd w:id="106"/>
+    <w:bookmarkStart w:id="108" w:name="ref-Hammond2006"/>
     <w:p>
       <w:pPr>
         <w:pStyle w:val="Bibliography"/>
@@ -6370,7 +6105,7 @@
       <w:r>
         <w:t xml:space="preserve"> </w:t>
       </w:r>
-      <w:hyperlink r:id="rId120">
+      <w:hyperlink r:id="rId107">
         <w:r>
           <w:rPr>
             <w:rStyle w:val="Hyperlink"/>
@@ -6382,8 +6117,8 @@
         <w:t xml:space="preserve">.</w:t>
       </w:r>
     </w:p>
-    <w:bookmarkEnd w:id="121"/>
-    <w:bookmarkStart w:id="122" w:name="ref-Harding2009"/>
+    <w:bookmarkEnd w:id="108"/>
+    <w:bookmarkStart w:id="109" w:name="ref-Harding2009"/>
     <w:p>
       <w:pPr>
         <w:pStyle w:val="Bibliography"/>
@@ -6401,8 +6136,8 @@
         <w:t xml:space="preserve">. School of Biological Sciences, University of Canterbury.</w:t>
       </w:r>
     </w:p>
-    <w:bookmarkEnd w:id="122"/>
-    <w:bookmarkStart w:id="124" w:name="ref-Haschenburger2009"/>
+    <w:bookmarkEnd w:id="109"/>
+    <w:bookmarkStart w:id="111" w:name="ref-Haschenburger2009"/>
     <w:p>
       <w:pPr>
         <w:pStyle w:val="Bibliography"/>
@@ -6413,7 +6148,7 @@
       <w:r>
         <w:t xml:space="preserve"> </w:t>
       </w:r>
-      <w:hyperlink r:id="rId123">
+      <w:hyperlink r:id="rId110">
         <w:r>
           <w:rPr>
             <w:rStyle w:val="Hyperlink"/>
@@ -6425,8 +6160,8 @@
         <w:t xml:space="preserve">.</w:t>
       </w:r>
     </w:p>
-    <w:bookmarkEnd w:id="124"/>
-    <w:bookmarkStart w:id="126" w:name="ref-Hesni2009"/>
+    <w:bookmarkEnd w:id="111"/>
+    <w:bookmarkStart w:id="113" w:name="ref-Hesni2009"/>
     <w:p>
       <w:pPr>
         <w:pStyle w:val="Bibliography"/>
@@ -6471,7 +6206,7 @@
       <w:r>
         <w:t xml:space="preserve"> </w:t>
       </w:r>
-      <w:hyperlink r:id="rId125">
+      <w:hyperlink r:id="rId112">
         <w:r>
           <w:rPr>
             <w:rStyle w:val="Hyperlink"/>
@@ -6483,8 +6218,8 @@
         <w:t xml:space="preserve">.</w:t>
       </w:r>
     </w:p>
-    <w:bookmarkEnd w:id="126"/>
-    <w:bookmarkStart w:id="128" w:name="ref-Hessen2004"/>
+    <w:bookmarkEnd w:id="113"/>
+    <w:bookmarkStart w:id="115" w:name="ref-Hessen2004"/>
     <w:p>
       <w:pPr>
         <w:pStyle w:val="Bibliography"/>
@@ -6495,7 +6230,7 @@
       <w:r>
         <w:t xml:space="preserve"> </w:t>
       </w:r>
-      <w:hyperlink r:id="rId127">
+      <w:hyperlink r:id="rId114">
         <w:r>
           <w:rPr>
             <w:rStyle w:val="Hyperlink"/>
@@ -6507,8 +6242,8 @@
         <w:t xml:space="preserve">.</w:t>
       </w:r>
     </w:p>
-    <w:bookmarkEnd w:id="128"/>
-    <w:bookmarkStart w:id="129" w:name="ref-Hiroa1921"/>
+    <w:bookmarkEnd w:id="115"/>
+    <w:bookmarkStart w:id="116" w:name="ref-Hiroa1921"/>
     <w:p>
       <w:pPr>
         <w:pStyle w:val="Bibliography"/>
@@ -6532,8 +6267,8 @@
         <w:t xml:space="preserve">, with methods of obtaining them, and usages and customs appertaining thereto. Transactions and Proceedings of the Royal Society of New Zealand 1868-1961 53: 433–451.</w:t>
       </w:r>
     </w:p>
-    <w:bookmarkEnd w:id="129"/>
-    <w:bookmarkStart w:id="131" w:name="ref-Hopkins1970"/>
+    <w:bookmarkEnd w:id="116"/>
+    <w:bookmarkStart w:id="118" w:name="ref-Hopkins1970"/>
     <w:p>
       <w:pPr>
         <w:pStyle w:val="Bibliography"/>
@@ -6596,7 +6331,7 @@
       <w:r>
         <w:t xml:space="preserve"> </w:t>
       </w:r>
-      <w:hyperlink r:id="rId130">
+      <w:hyperlink r:id="rId117">
         <w:r>
           <w:rPr>
             <w:rStyle w:val="Hyperlink"/>
@@ -6608,8 +6343,8 @@
         <w:t xml:space="preserve">.</w:t>
       </w:r>
     </w:p>
-    <w:bookmarkEnd w:id="131"/>
-    <w:bookmarkStart w:id="133" w:name="ref-Jane2021"/>
+    <w:bookmarkEnd w:id="118"/>
+    <w:bookmarkStart w:id="120" w:name="ref-Jane2021"/>
     <w:p>
       <w:pPr>
         <w:pStyle w:val="Bibliography"/>
@@ -6623,7 +6358,7 @@
       <w:r>
         <w:t xml:space="preserve"> </w:t>
       </w:r>
-      <w:hyperlink r:id="rId132">
+      <w:hyperlink r:id="rId119">
         <w:r>
           <w:rPr>
             <w:rStyle w:val="Hyperlink"/>
@@ -6635,8 +6370,8 @@
         <w:t xml:space="preserve">.</w:t>
       </w:r>
     </w:p>
-    <w:bookmarkEnd w:id="133"/>
-    <w:bookmarkStart w:id="134" w:name="ref-Johnsen2008"/>
+    <w:bookmarkEnd w:id="120"/>
+    <w:bookmarkStart w:id="121" w:name="ref-Johnsen2008"/>
     <w:p>
       <w:pPr>
         <w:pStyle w:val="Bibliography"/>
@@ -6645,8 +6380,8 @@
         <w:t xml:space="preserve">Johnsen, S. I., &amp; T. Taugbøl, 2008. Add stones, get crayfish - is it that simple? Freshwater Crayfish 16: 47–50.</w:t>
       </w:r>
     </w:p>
-    <w:bookmarkEnd w:id="134"/>
-    <w:bookmarkStart w:id="136" w:name="ref-Jowett2008"/>
+    <w:bookmarkEnd w:id="121"/>
+    <w:bookmarkStart w:id="123" w:name="ref-Jowett2008"/>
     <w:p>
       <w:pPr>
         <w:pStyle w:val="Bibliography"/>
@@ -6685,7 +6420,7 @@
       <w:r>
         <w:t xml:space="preserve"> </w:t>
       </w:r>
-      <w:hyperlink r:id="rId135">
+      <w:hyperlink r:id="rId122">
         <w:r>
           <w:rPr>
             <w:rStyle w:val="Hyperlink"/>
@@ -6697,8 +6432,8 @@
         <w:t xml:space="preserve">.</w:t>
       </w:r>
     </w:p>
-    <w:bookmarkEnd w:id="136"/>
-    <w:bookmarkStart w:id="138" w:name="ref-Jowett1990"/>
+    <w:bookmarkEnd w:id="123"/>
+    <w:bookmarkStart w:id="125" w:name="ref-Jowett1990"/>
     <w:p>
       <w:pPr>
         <w:pStyle w:val="Bibliography"/>
@@ -6737,7 +6472,7 @@
       <w:r>
         <w:t xml:space="preserve"> </w:t>
       </w:r>
-      <w:hyperlink r:id="rId137">
+      <w:hyperlink r:id="rId124">
         <w:r>
           <w:rPr>
             <w:rStyle w:val="Hyperlink"/>
@@ -6749,8 +6484,8 @@
         <w:t xml:space="preserve">.</w:t>
       </w:r>
     </w:p>
-    <w:bookmarkEnd w:id="138"/>
-    <w:bookmarkStart w:id="140" w:name="ref-Kusabs2026"/>
+    <w:bookmarkEnd w:id="125"/>
+    <w:bookmarkStart w:id="127" w:name="ref-Kusabs2026"/>
     <w:p>
       <w:pPr>
         <w:pStyle w:val="Bibliography"/>
@@ -6773,7 +6508,7 @@
       <w:r>
         <w:t xml:space="preserve"> </w:t>
       </w:r>
-      <w:hyperlink r:id="rId139">
+      <w:hyperlink r:id="rId126">
         <w:r>
           <w:rPr>
             <w:rStyle w:val="Hyperlink"/>
@@ -6785,8 +6520,8 @@
         <w:t xml:space="preserve">.</w:t>
       </w:r>
     </w:p>
-    <w:bookmarkEnd w:id="140"/>
-    <w:bookmarkStart w:id="142" w:name="ref-Kusabs2015a"/>
+    <w:bookmarkEnd w:id="127"/>
+    <w:bookmarkStart w:id="129" w:name="ref-Kusabs2015a"/>
     <w:p>
       <w:pPr>
         <w:pStyle w:val="Bibliography"/>
@@ -6843,7 +6578,7 @@
       <w:r>
         <w:t xml:space="preserve"> </w:t>
       </w:r>
-      <w:hyperlink r:id="rId141">
+      <w:hyperlink r:id="rId128">
         <w:r>
           <w:rPr>
             <w:rStyle w:val="Hyperlink"/>
@@ -6855,8 +6590,8 @@
         <w:t xml:space="preserve">.</w:t>
       </w:r>
     </w:p>
-    <w:bookmarkEnd w:id="142"/>
-    <w:bookmarkStart w:id="144" w:name="ref-Kusabs2009"/>
+    <w:bookmarkEnd w:id="129"/>
+    <w:bookmarkStart w:id="131" w:name="ref-Kusabs2009"/>
     <w:p>
       <w:pPr>
         <w:pStyle w:val="Bibliography"/>
@@ -6922,7 +6657,7 @@
       <w:r>
         <w:t xml:space="preserve"> </w:t>
       </w:r>
-      <w:hyperlink r:id="rId143">
+      <w:hyperlink r:id="rId130">
         <w:r>
           <w:rPr>
             <w:rStyle w:val="Hyperlink"/>
@@ -6934,8 +6669,8 @@
         <w:t xml:space="preserve">.</w:t>
       </w:r>
     </w:p>
-    <w:bookmarkEnd w:id="144"/>
-    <w:bookmarkStart w:id="146" w:name="ref-Kusabs2015b"/>
+    <w:bookmarkEnd w:id="131"/>
+    <w:bookmarkStart w:id="133" w:name="ref-Kusabs2015b"/>
     <w:p>
       <w:pPr>
         <w:pStyle w:val="Bibliography"/>
@@ -6992,7 +6727,7 @@
       <w:r>
         <w:t xml:space="preserve"> </w:t>
       </w:r>
-      <w:hyperlink r:id="rId145">
+      <w:hyperlink r:id="rId132">
         <w:r>
           <w:rPr>
             <w:rStyle w:val="Hyperlink"/>
@@ -7004,8 +6739,8 @@
         <w:t xml:space="preserve">.</w:t>
       </w:r>
     </w:p>
-    <w:bookmarkEnd w:id="146"/>
-    <w:bookmarkStart w:id="147" w:name="ref-Kutner2005"/>
+    <w:bookmarkEnd w:id="133"/>
+    <w:bookmarkStart w:id="134" w:name="ref-Kutner2005"/>
     <w:p>
       <w:pPr>
         <w:pStyle w:val="Bibliography"/>
@@ -7014,8 +6749,8 @@
         <w:t xml:space="preserve">Kutner, M. H., C. J. Nachtsheim, J. Neter, &amp; W. Li, 2005. Applied linear statistical models. McGraw-Hill Irwin.</w:t>
       </w:r>
     </w:p>
-    <w:bookmarkEnd w:id="147"/>
-    <w:bookmarkStart w:id="149" w:name="ref-LAWA2025"/>
+    <w:bookmarkEnd w:id="134"/>
+    <w:bookmarkStart w:id="136" w:name="ref-LAWA2025"/>
     <w:p>
       <w:pPr>
         <w:pStyle w:val="Bibliography"/>
@@ -7038,7 +6773,7 @@
       <w:r>
         <w:t xml:space="preserve"> </w:t>
       </w:r>
-      <w:hyperlink r:id="rId148">
+      <w:hyperlink r:id="rId135">
         <w:r>
           <w:rPr>
             <w:rStyle w:val="Hyperlink"/>
@@ -7050,8 +6785,8 @@
         <w:t xml:space="preserve">.</w:t>
       </w:r>
     </w:p>
-    <w:bookmarkEnd w:id="149"/>
-    <w:bookmarkStart w:id="151" w:name="ref-Lee2025"/>
+    <w:bookmarkEnd w:id="136"/>
+    <w:bookmarkStart w:id="138" w:name="ref-Lee2025"/>
     <w:p>
       <w:pPr>
         <w:pStyle w:val="Bibliography"/>
@@ -7062,7 +6797,7 @@
       <w:r>
         <w:t xml:space="preserve"> </w:t>
       </w:r>
-      <w:hyperlink r:id="rId150">
+      <w:hyperlink r:id="rId137">
         <w:r>
           <w:rPr>
             <w:rStyle w:val="Hyperlink"/>
@@ -7074,8 +6809,8 @@
         <w:t xml:space="preserve">.</w:t>
       </w:r>
     </w:p>
-    <w:bookmarkEnd w:id="151"/>
-    <w:bookmarkStart w:id="153" w:name="ref-Levin1992"/>
+    <w:bookmarkEnd w:id="138"/>
+    <w:bookmarkStart w:id="140" w:name="ref-Levin1992"/>
     <w:p>
       <w:pPr>
         <w:pStyle w:val="Bibliography"/>
@@ -7098,7 +6833,7 @@
       <w:r>
         <w:t xml:space="preserve"> </w:t>
       </w:r>
-      <w:hyperlink r:id="rId152">
+      <w:hyperlink r:id="rId139">
         <w:r>
           <w:rPr>
             <w:rStyle w:val="Hyperlink"/>
@@ -7110,8 +6845,8 @@
         <w:t xml:space="preserve">.</w:t>
       </w:r>
     </w:p>
-    <w:bookmarkEnd w:id="153"/>
-    <w:bookmarkStart w:id="155" w:name="ref-Lishawa2023"/>
+    <w:bookmarkEnd w:id="140"/>
+    <w:bookmarkStart w:id="142" w:name="ref-Lishawa2023"/>
     <w:p>
       <w:pPr>
         <w:pStyle w:val="Bibliography"/>
@@ -7147,7 +6882,7 @@
       <w:r>
         <w:t xml:space="preserve"> </w:t>
       </w:r>
-      <w:hyperlink r:id="rId154">
+      <w:hyperlink r:id="rId141">
         <w:r>
           <w:rPr>
             <w:rStyle w:val="Hyperlink"/>
@@ -7159,8 +6894,8 @@
         <w:t xml:space="preserve">.</w:t>
       </w:r>
     </w:p>
-    <w:bookmarkEnd w:id="155"/>
-    <w:bookmarkStart w:id="157" w:name="ref-Meerhoff2022"/>
+    <w:bookmarkEnd w:id="142"/>
+    <w:bookmarkStart w:id="144" w:name="ref-Meerhoff2022"/>
     <w:p>
       <w:pPr>
         <w:pStyle w:val="Bibliography"/>
@@ -7171,7 +6906,7 @@
       <w:r>
         <w:t xml:space="preserve"> </w:t>
       </w:r>
-      <w:hyperlink r:id="rId156">
+      <w:hyperlink r:id="rId143">
         <w:r>
           <w:rPr>
             <w:rStyle w:val="Hyperlink"/>
@@ -7183,8 +6918,8 @@
         <w:t xml:space="preserve">.</w:t>
       </w:r>
     </w:p>
-    <w:bookmarkEnd w:id="157"/>
-    <w:bookmarkStart w:id="159" w:name="ref-Momot1995"/>
+    <w:bookmarkEnd w:id="144"/>
+    <w:bookmarkStart w:id="146" w:name="ref-Momot1995"/>
     <w:p>
       <w:pPr>
         <w:pStyle w:val="Bibliography"/>
@@ -7195,7 +6930,7 @@
       <w:r>
         <w:t xml:space="preserve"> </w:t>
       </w:r>
-      <w:hyperlink r:id="rId158">
+      <w:hyperlink r:id="rId145">
         <w:r>
           <w:rPr>
             <w:rStyle w:val="Hyperlink"/>
@@ -7207,8 +6942,8 @@
         <w:t xml:space="preserve">.</w:t>
       </w:r>
     </w:p>
-    <w:bookmarkEnd w:id="159"/>
-    <w:bookmarkStart w:id="161" w:name="ref-Nystrom2006"/>
+    <w:bookmarkEnd w:id="146"/>
+    <w:bookmarkStart w:id="148" w:name="ref-Nystrom2006"/>
     <w:p>
       <w:pPr>
         <w:pStyle w:val="Bibliography"/>
@@ -7219,7 +6954,7 @@
       <w:r>
         <w:t xml:space="preserve"> </w:t>
       </w:r>
-      <w:hyperlink r:id="rId160">
+      <w:hyperlink r:id="rId147">
         <w:r>
           <w:rPr>
             <w:rStyle w:val="Hyperlink"/>
@@ -7231,8 +6966,8 @@
         <w:t xml:space="preserve">.</w:t>
       </w:r>
     </w:p>
-    <w:bookmarkEnd w:id="161"/>
-    <w:bookmarkStart w:id="163" w:name="ref-Olsson2006"/>
+    <w:bookmarkEnd w:id="148"/>
+    <w:bookmarkStart w:id="150" w:name="ref-Olsson2006"/>
     <w:p>
       <w:pPr>
         <w:pStyle w:val="Bibliography"/>
@@ -7255,7 +6990,7 @@
       <w:r>
         <w:t xml:space="preserve"> </w:t>
       </w:r>
-      <w:hyperlink r:id="rId162">
+      <w:hyperlink r:id="rId149">
         <w:r>
           <w:rPr>
             <w:rStyle w:val="Hyperlink"/>
@@ -7267,8 +7002,8 @@
         <w:t xml:space="preserve">.</w:t>
       </w:r>
     </w:p>
-    <w:bookmarkEnd w:id="163"/>
-    <w:bookmarkStart w:id="164" w:name="ref-Parkyn2002"/>
+    <w:bookmarkEnd w:id="150"/>
+    <w:bookmarkStart w:id="151" w:name="ref-Parkyn2002"/>
     <w:p>
       <w:pPr>
         <w:pStyle w:val="Bibliography"/>
@@ -7287,8 +7022,8 @@
         <w:t xml:space="preserve">) growth: Leaf detritus versus invertebrate food sources at two diurnally varying temperatures. Freshwater Crayfish 13: 371–382.</w:t>
       </w:r>
     </w:p>
-    <w:bookmarkEnd w:id="164"/>
-    <w:bookmarkStart w:id="166" w:name="ref-Parkyn2004"/>
+    <w:bookmarkEnd w:id="151"/>
+    <w:bookmarkStart w:id="153" w:name="ref-Parkyn2004"/>
     <w:p>
       <w:pPr>
         <w:pStyle w:val="Bibliography"/>
@@ -7299,7 +7034,7 @@
       <w:r>
         <w:t xml:space="preserve"> </w:t>
       </w:r>
-      <w:hyperlink r:id="rId165">
+      <w:hyperlink r:id="rId152">
         <w:r>
           <w:rPr>
             <w:rStyle w:val="Hyperlink"/>
@@ -7311,8 +7046,8 @@
         <w:t xml:space="preserve">.</w:t>
       </w:r>
     </w:p>
-    <w:bookmarkEnd w:id="166"/>
-    <w:bookmarkStart w:id="168" w:name="ref-Parkyn2001"/>
+    <w:bookmarkEnd w:id="153"/>
+    <w:bookmarkStart w:id="155" w:name="ref-Parkyn2001"/>
     <w:p>
       <w:pPr>
         <w:pStyle w:val="Bibliography"/>
@@ -7335,7 +7070,7 @@
       <w:r>
         <w:t xml:space="preserve"> </w:t>
       </w:r>
-      <w:hyperlink r:id="rId167">
+      <w:hyperlink r:id="rId154">
         <w:r>
           <w:rPr>
             <w:rStyle w:val="Hyperlink"/>
@@ -7347,8 +7082,8 @@
         <w:t xml:space="preserve">.</w:t>
       </w:r>
     </w:p>
-    <w:bookmarkEnd w:id="168"/>
-    <w:bookmarkStart w:id="170" w:name="ref-Parkyn2009"/>
+    <w:bookmarkEnd w:id="155"/>
+    <w:bookmarkStart w:id="157" w:name="ref-Parkyn2009"/>
     <w:p>
       <w:pPr>
         <w:pStyle w:val="Bibliography"/>
@@ -7369,7 +7104,7 @@
       <w:r>
         <w:t xml:space="preserve"> </w:t>
       </w:r>
-      <w:hyperlink r:id="rId169">
+      <w:hyperlink r:id="rId156">
         <w:r>
           <w:rPr>
             <w:rStyle w:val="Hyperlink"/>
@@ -7381,8 +7116,8 @@
         <w:t xml:space="preserve">.</w:t>
       </w:r>
     </w:p>
-    <w:bookmarkEnd w:id="170"/>
-    <w:bookmarkStart w:id="171" w:name="ref-Quinn2002"/>
+    <w:bookmarkEnd w:id="157"/>
+    <w:bookmarkStart w:id="158" w:name="ref-Quinn2002"/>
     <w:p>
       <w:pPr>
         <w:pStyle w:val="Bibliography"/>
@@ -7391,8 +7126,8 @@
         <w:t xml:space="preserve">Quinn, G. P., &amp; M. J. Keough, 2002. Experimental design and data analysis for biologists. Cambridge University Press.</w:t>
       </w:r>
     </w:p>
-    <w:bookmarkEnd w:id="171"/>
-    <w:bookmarkStart w:id="173" w:name="ref-Quinn1990"/>
+    <w:bookmarkEnd w:id="158"/>
+    <w:bookmarkStart w:id="160" w:name="ref-Quinn1990"/>
     <w:p>
       <w:pPr>
         <w:pStyle w:val="Bibliography"/>
@@ -7415,7 +7150,7 @@
       <w:r>
         <w:t xml:space="preserve"> </w:t>
       </w:r>
-      <w:hyperlink r:id="rId172">
+      <w:hyperlink r:id="rId159">
         <w:r>
           <w:rPr>
             <w:rStyle w:val="Hyperlink"/>
@@ -7427,8 +7162,8 @@
         <w:t xml:space="preserve">.</w:t>
       </w:r>
     </w:p>
-    <w:bookmarkEnd w:id="173"/>
-    <w:bookmarkStart w:id="175" w:name="ref-RCoreTeam2025"/>
+    <w:bookmarkEnd w:id="160"/>
+    <w:bookmarkStart w:id="162" w:name="ref-RCoreTeam2025"/>
     <w:p>
       <w:pPr>
         <w:pStyle w:val="Bibliography"/>
@@ -7439,7 +7174,7 @@
       <w:r>
         <w:t xml:space="preserve"> </w:t>
       </w:r>
-      <w:hyperlink r:id="rId174">
+      <w:hyperlink r:id="rId161">
         <w:r>
           <w:rPr>
             <w:rStyle w:val="Hyperlink"/>
@@ -7457,8 +7192,8 @@
         <w:t xml:space="preserve">. R Foundation for Statistical Computing, Vienna, Austria.</w:t>
       </w:r>
     </w:p>
-    <w:bookmarkEnd w:id="175"/>
-    <w:bookmarkStart w:id="177" w:name="ref-Richman2015"/>
+    <w:bookmarkEnd w:id="162"/>
+    <w:bookmarkStart w:id="164" w:name="ref-Richman2015"/>
     <w:p>
       <w:pPr>
         <w:pStyle w:val="Bibliography"/>
@@ -7487,7 +7222,7 @@
       <w:r>
         <w:t xml:space="preserve"> </w:t>
       </w:r>
-      <w:hyperlink r:id="rId176">
+      <w:hyperlink r:id="rId163">
         <w:r>
           <w:rPr>
             <w:rStyle w:val="Hyperlink"/>
@@ -7499,8 +7234,8 @@
         <w:t xml:space="preserve">.</w:t>
       </w:r>
     </w:p>
-    <w:bookmarkEnd w:id="177"/>
-    <w:bookmarkStart w:id="179" w:name="ref-Rosewarne2013"/>
+    <w:bookmarkEnd w:id="164"/>
+    <w:bookmarkStart w:id="166" w:name="ref-Rosewarne2013"/>
     <w:p>
       <w:pPr>
         <w:pStyle w:val="Bibliography"/>
@@ -7521,7 +7256,7 @@
       <w:r>
         <w:t xml:space="preserve"> </w:t>
       </w:r>
-      <w:hyperlink r:id="rId178">
+      <w:hyperlink r:id="rId165">
         <w:r>
           <w:rPr>
             <w:rStyle w:val="Hyperlink"/>
@@ -7533,8 +7268,8 @@
         <w:t xml:space="preserve">.</w:t>
       </w:r>
     </w:p>
-    <w:bookmarkEnd w:id="179"/>
-    <w:bookmarkStart w:id="181" w:name="ref-Rowe1993"/>
+    <w:bookmarkEnd w:id="166"/>
+    <w:bookmarkStart w:id="168" w:name="ref-Rowe1993"/>
     <w:p>
       <w:pPr>
         <w:pStyle w:val="Bibliography"/>
@@ -7563,7 +7298,7 @@
       <w:r>
         <w:t xml:space="preserve"> </w:t>
       </w:r>
-      <w:hyperlink r:id="rId180">
+      <w:hyperlink r:id="rId167">
         <w:r>
           <w:rPr>
             <w:rStyle w:val="Hyperlink"/>
@@ -7575,8 +7310,8 @@
         <w:t xml:space="preserve">.</w:t>
       </w:r>
     </w:p>
-    <w:bookmarkEnd w:id="181"/>
-    <w:bookmarkStart w:id="183" w:name="ref-Schoen2015"/>
+    <w:bookmarkEnd w:id="168"/>
+    <w:bookmarkStart w:id="170" w:name="ref-Schoen2015"/>
     <w:p>
       <w:pPr>
         <w:pStyle w:val="Bibliography"/>
@@ -7603,7 +7338,7 @@
       <w:r>
         <w:t xml:space="preserve"> </w:t>
       </w:r>
-      <w:hyperlink r:id="rId182">
+      <w:hyperlink r:id="rId169">
         <w:r>
           <w:rPr>
             <w:rStyle w:val="Hyperlink"/>
@@ -7615,8 +7350,8 @@
         <w:t xml:space="preserve">.</w:t>
       </w:r>
     </w:p>
-    <w:bookmarkEnd w:id="183"/>
-    <w:bookmarkStart w:id="185" w:name="ref-Schrank2019"/>
+    <w:bookmarkEnd w:id="170"/>
+    <w:bookmarkStart w:id="172" w:name="ref-Schrank2019"/>
     <w:p>
       <w:pPr>
         <w:pStyle w:val="Bibliography"/>
@@ -7639,7 +7374,7 @@
       <w:r>
         <w:t xml:space="preserve"> </w:t>
       </w:r>
-      <w:hyperlink r:id="rId184">
+      <w:hyperlink r:id="rId171">
         <w:r>
           <w:rPr>
             <w:rStyle w:val="Hyperlink"/>
@@ -7651,8 +7386,8 @@
         <w:t xml:space="preserve">.</w:t>
       </w:r>
     </w:p>
-    <w:bookmarkEnd w:id="185"/>
-    <w:bookmarkStart w:id="186" w:name="ref-Shave1994"/>
+    <w:bookmarkEnd w:id="172"/>
+    <w:bookmarkStart w:id="173" w:name="ref-Shave1994"/>
     <w:p>
       <w:pPr>
         <w:pStyle w:val="Bibliography"/>
@@ -7671,8 +7406,8 @@
         <w:t xml:space="preserve">) to a native and an introduced predator. New Zealand Journal of Ecology 18: 1–10.</w:t>
       </w:r>
     </w:p>
-    <w:bookmarkEnd w:id="186"/>
-    <w:bookmarkStart w:id="188" w:name="ref-Shono2008"/>
+    <w:bookmarkEnd w:id="173"/>
+    <w:bookmarkStart w:id="175" w:name="ref-Shono2008"/>
     <w:p>
       <w:pPr>
         <w:pStyle w:val="Bibliography"/>
@@ -7707,7 +7442,7 @@
       <w:r>
         <w:t xml:space="preserve"> </w:t>
       </w:r>
-      <w:hyperlink r:id="rId187">
+      <w:hyperlink r:id="rId174">
         <w:r>
           <w:rPr>
             <w:rStyle w:val="Hyperlink"/>
@@ -7719,8 +7454,8 @@
         <w:t xml:space="preserve">.</w:t>
       </w:r>
     </w:p>
-    <w:bookmarkEnd w:id="188"/>
-    <w:bookmarkStart w:id="190" w:name="ref-Smith1996"/>
+    <w:bookmarkEnd w:id="175"/>
+    <w:bookmarkStart w:id="177" w:name="ref-Smith1996"/>
     <w:p>
       <w:pPr>
         <w:pStyle w:val="Bibliography"/>
@@ -7756,7 +7491,7 @@
       <w:r>
         <w:t xml:space="preserve"> </w:t>
       </w:r>
-      <w:hyperlink r:id="rId189">
+      <w:hyperlink r:id="rId176">
         <w:r>
           <w:rPr>
             <w:rStyle w:val="Hyperlink"/>
@@ -7768,8 +7503,8 @@
         <w:t xml:space="preserve">.</w:t>
       </w:r>
     </w:p>
-    <w:bookmarkEnd w:id="190"/>
-    <w:bookmarkStart w:id="192" w:name="ref-Statzner2003"/>
+    <w:bookmarkEnd w:id="177"/>
+    <w:bookmarkStart w:id="179" w:name="ref-Statzner2003"/>
     <w:p>
       <w:pPr>
         <w:pStyle w:val="Bibliography"/>
@@ -7780,7 +7515,7 @@
       <w:r>
         <w:t xml:space="preserve"> </w:t>
       </w:r>
-      <w:hyperlink r:id="rId191">
+      <w:hyperlink r:id="rId178">
         <w:r>
           <w:rPr>
             <w:rStyle w:val="Hyperlink"/>
@@ -7792,8 +7527,8 @@
         <w:t xml:space="preserve">.</w:t>
       </w:r>
     </w:p>
-    <w:bookmarkEnd w:id="192"/>
-    <w:bookmarkStart w:id="194" w:name="ref-Stevens2004"/>
+    <w:bookmarkEnd w:id="179"/>
+    <w:bookmarkStart w:id="181" w:name="ref-Stevens2004"/>
     <w:p>
       <w:pPr>
         <w:pStyle w:val="Bibliography"/>
@@ -7804,7 +7539,7 @@
       <w:r>
         <w:t xml:space="preserve"> </w:t>
       </w:r>
-      <w:hyperlink r:id="rId193">
+      <w:hyperlink r:id="rId180">
         <w:r>
           <w:rPr>
             <w:rStyle w:val="Hyperlink"/>
@@ -7816,8 +7551,8 @@
         <w:t xml:space="preserve">.</w:t>
       </w:r>
     </w:p>
-    <w:bookmarkEnd w:id="194"/>
-    <w:bookmarkStart w:id="196" w:name="ref-Strayer2010"/>
+    <w:bookmarkEnd w:id="181"/>
+    <w:bookmarkStart w:id="183" w:name="ref-Strayer2010"/>
     <w:p>
       <w:pPr>
         <w:pStyle w:val="Bibliography"/>
@@ -7828,7 +7563,7 @@
       <w:r>
         <w:t xml:space="preserve"> </w:t>
       </w:r>
-      <w:hyperlink r:id="rId195">
+      <w:hyperlink r:id="rId182">
         <w:r>
           <w:rPr>
             <w:rStyle w:val="Hyperlink"/>
@@ -7840,8 +7575,8 @@
         <w:t xml:space="preserve">.</w:t>
       </w:r>
     </w:p>
-    <w:bookmarkEnd w:id="196"/>
-    <w:bookmarkStart w:id="198" w:name="ref-Taylor2019"/>
+    <w:bookmarkEnd w:id="183"/>
+    <w:bookmarkStart w:id="185" w:name="ref-Taylor2019"/>
     <w:p>
       <w:pPr>
         <w:pStyle w:val="Bibliography"/>
@@ -7861,7 +7596,7 @@
       <w:r>
         <w:t xml:space="preserve"> </w:t>
       </w:r>
-      <w:hyperlink r:id="rId197">
+      <w:hyperlink r:id="rId184">
         <w:r>
           <w:rPr>
             <w:rStyle w:val="Hyperlink"/>
@@ -7873,8 +7608,8 @@
         <w:t xml:space="preserve">.</w:t>
       </w:r>
     </w:p>
-    <w:bookmarkEnd w:id="198"/>
-    <w:bookmarkStart w:id="200" w:name="ref-Usio2000"/>
+    <w:bookmarkEnd w:id="185"/>
+    <w:bookmarkStart w:id="187" w:name="ref-Usio2000"/>
     <w:p>
       <w:pPr>
         <w:pStyle w:val="Bibliography"/>
@@ -7907,12 +7642,214 @@
       <w:r>
         <w:t xml:space="preserve"> </w:t>
       </w:r>
+      <w:hyperlink r:id="rId186">
+        <w:r>
+          <w:rPr>
+            <w:rStyle w:val="Hyperlink"/>
+          </w:rPr>
+          <w:t xml:space="preserve">https://doi.org/10.1080/00288330.2000.9516957</w:t>
+        </w:r>
+      </w:hyperlink>
+      <w:r>
+        <w:t xml:space="preserve">.</w:t>
+      </w:r>
+    </w:p>
+    <w:bookmarkEnd w:id="187"/>
+    <w:bookmarkStart w:id="189" w:name="ref-Usio2004"/>
+    <w:p>
+      <w:pPr>
+        <w:pStyle w:val="Bibliography"/>
+      </w:pPr>
+      <w:r>
+        <w:t xml:space="preserve">Usio, N., &amp; C. R. Townsend, 2004. Roles of crayfish: Consequences of predation and bioturbation for stream invertebrates. Ecology 85: 807–822.</w:t>
+      </w:r>
+      <w:r>
+        <w:t xml:space="preserve"> </w:t>
+      </w:r>
+      <w:hyperlink r:id="rId188">
+        <w:r>
+          <w:rPr>
+            <w:rStyle w:val="Hyperlink"/>
+          </w:rPr>
+          <w:t xml:space="preserve">https://doi.org/10.1890/02-0618</w:t>
+        </w:r>
+      </w:hyperlink>
+      <w:r>
+        <w:t xml:space="preserve">.</w:t>
+      </w:r>
+    </w:p>
+    <w:bookmarkEnd w:id="189"/>
+    <w:bookmarkStart w:id="191" w:name="ref-Vedia2017"/>
+    <w:p>
+      <w:pPr>
+        <w:pStyle w:val="Bibliography"/>
+      </w:pPr>
+      <w:r>
+        <w:t xml:space="preserve">Vedia, I., D. Galicia, E. Baquero, J. Oscoz, &amp; R. Miranda, 2017. Environmental factors influencing the distribution and abundance of the introduced signal crayfish in the north of</w:t>
+      </w:r>
+      <w:r>
+        <w:t xml:space="preserve"> </w:t>
+      </w:r>
+      <w:r>
+        <w:t xml:space="preserve">Iberian Peninsula</w:t>
+      </w:r>
+      <w:r>
+        <w:t xml:space="preserve">. Marine and Freshwater Research 68: 900–908.</w:t>
+      </w:r>
+      <w:r>
+        <w:t xml:space="preserve"> </w:t>
+      </w:r>
+      <w:hyperlink r:id="rId190">
+        <w:r>
+          <w:rPr>
+            <w:rStyle w:val="Hyperlink"/>
+          </w:rPr>
+          <w:t xml:space="preserve">https://doi.org/10.1071/MF16020</w:t>
+        </w:r>
+      </w:hyperlink>
+      <w:r>
+        <w:t xml:space="preserve">.</w:t>
+      </w:r>
+    </w:p>
+    <w:bookmarkEnd w:id="191"/>
+    <w:bookmarkStart w:id="193" w:name="ref-Vincent1984"/>
+    <w:p>
+      <w:pPr>
+        <w:pStyle w:val="Bibliography"/>
+      </w:pPr>
+      <w:r>
+        <w:t xml:space="preserve">Vincent, W. F., M. M. Gibbs, &amp; S. J. Dryden, 1984. Accelerated eutrophication in a</w:t>
+      </w:r>
+      <w:r>
+        <w:t xml:space="preserve"> </w:t>
+      </w:r>
+      <w:r>
+        <w:t xml:space="preserve">New Zealand</w:t>
+      </w:r>
+      <w:r>
+        <w:t xml:space="preserve"> </w:t>
+      </w:r>
+      <w:r>
+        <w:t xml:space="preserve">lake:</w:t>
+      </w:r>
+      <w:r>
+        <w:t xml:space="preserve"> </w:t>
+      </w:r>
+      <w:r>
+        <w:t xml:space="preserve">Lake Rotoiti</w:t>
+      </w:r>
+      <w:r>
+        <w:t xml:space="preserve">, central</w:t>
+      </w:r>
+      <w:r>
+        <w:t xml:space="preserve"> </w:t>
+      </w:r>
+      <w:r>
+        <w:t xml:space="preserve">North Island</w:t>
+      </w:r>
+      <w:r>
+        <w:t xml:space="preserve">. New Zealand Journal of Marine and Freshwater Research 18: 431–440.</w:t>
+      </w:r>
+      <w:r>
+        <w:t xml:space="preserve"> </w:t>
+      </w:r>
+      <w:hyperlink r:id="rId192">
+        <w:r>
+          <w:rPr>
+            <w:rStyle w:val="Hyperlink"/>
+          </w:rPr>
+          <w:t xml:space="preserve">https://doi.org/10.1080/00288330.1984.9516064</w:t>
+        </w:r>
+      </w:hyperlink>
+      <w:r>
+        <w:t xml:space="preserve">.</w:t>
+      </w:r>
+    </w:p>
+    <w:bookmarkEnd w:id="193"/>
+    <w:bookmarkStart w:id="195" w:name="ref-vonWesternhagen2010"/>
+    <w:p>
+      <w:pPr>
+        <w:pStyle w:val="Bibliography"/>
+      </w:pPr>
+      <w:r>
+        <w:t xml:space="preserve">Westernhagen, N. von, D. P. Hamilton, &amp; C. A. Pilditch, 2010. Temporal and spatial variations in phytoplankton productivity in surface waters of a warm-temperate, monomictic lake in</w:t>
+      </w:r>
+      <w:r>
+        <w:t xml:space="preserve"> </w:t>
+      </w:r>
+      <w:r>
+        <w:t xml:space="preserve">New Zealand</w:t>
+      </w:r>
+      <w:r>
+        <w:t xml:space="preserve">. Hydrobiologia 652: 57–70.</w:t>
+      </w:r>
+      <w:r>
+        <w:t xml:space="preserve"> </w:t>
+      </w:r>
+      <w:hyperlink r:id="rId194">
+        <w:r>
+          <w:rPr>
+            <w:rStyle w:val="Hyperlink"/>
+          </w:rPr>
+          <w:t xml:space="preserve">https://doi.org/10.1007/s10750-010-0318-4</w:t>
+        </w:r>
+      </w:hyperlink>
+      <w:r>
+        <w:t xml:space="preserve">.</w:t>
+      </w:r>
+    </w:p>
+    <w:bookmarkEnd w:id="195"/>
+    <w:bookmarkStart w:id="196" w:name="ref-Wetzel2001"/>
+    <w:p>
+      <w:pPr>
+        <w:pStyle w:val="Bibliography"/>
+      </w:pPr>
+      <w:r>
+        <w:t xml:space="preserve">Wetzel, R. G., 2001. Limnology: Lake and river ecosystems. Gulf Professional Publishing.</w:t>
+      </w:r>
+    </w:p>
+    <w:bookmarkEnd w:id="196"/>
+    <w:bookmarkStart w:id="198" w:name="ref-White2003"/>
+    <w:p>
+      <w:pPr>
+        <w:pStyle w:val="Bibliography"/>
+      </w:pPr>
+      <w:r>
+        <w:t xml:space="preserve">White, J., &amp; K. Irvine, 2003. The use of littoral mesohabitats and their macroinvertebrate assemblages in the ecological assessment of lakes. Aquatic Conservation: Marine and Freshwater Ecosystems 13: 331–351.</w:t>
+      </w:r>
+      <w:r>
+        <w:t xml:space="preserve"> </w:t>
+      </w:r>
+      <w:hyperlink r:id="rId197">
+        <w:r>
+          <w:rPr>
+            <w:rStyle w:val="Hyperlink"/>
+          </w:rPr>
+          <w:t xml:space="preserve">https://doi.org/10.1002/aqc.586</w:t>
+        </w:r>
+      </w:hyperlink>
+      <w:r>
+        <w:t xml:space="preserve">.</w:t>
+      </w:r>
+    </w:p>
+    <w:bookmarkEnd w:id="198"/>
+    <w:bookmarkStart w:id="200" w:name="ref-Wood2004"/>
+    <w:p>
+      <w:pPr>
+        <w:pStyle w:val="Bibliography"/>
+      </w:pPr>
+      <w:r>
+        <w:t xml:space="preserve">Wood, S. N., 2004. Stable and efficient multiple smoothing parameter estimation for generalized additive models. Journal of the American Statistical Association 99: 673–686.</w:t>
+      </w:r>
+      <w:r>
+        <w:t xml:space="preserve"> </w:t>
+      </w:r>
       <w:hyperlink r:id="rId199">
         <w:r>
           <w:rPr>
             <w:rStyle w:val="Hyperlink"/>
           </w:rPr>
-          <w:t xml:space="preserve">https://doi.org/10.1080/00288330.2000.9516957</w:t>
+          <w:t xml:space="preserve">https://doi.org/10.1198/016214504000000980</w:t>
         </w:r>
       </w:hyperlink>
       <w:r>
@@ -7920,13 +7857,13 @@
       </w:r>
     </w:p>
     <w:bookmarkEnd w:id="200"/>
-    <w:bookmarkStart w:id="202" w:name="ref-Usio2004"/>
+    <w:bookmarkStart w:id="202" w:name="ref-Wood2017"/>
     <w:p>
       <w:pPr>
         <w:pStyle w:val="Bibliography"/>
       </w:pPr>
       <w:r>
-        <w:t xml:space="preserve">Usio, N., &amp; C. R. Townsend, 2004. Roles of crayfish: Consequences of predation and bioturbation for stream invertebrates. Ecology 85: 807–822.</w:t>
+        <w:t xml:space="preserve">Wood, S. N., 2017.</w:t>
       </w:r>
       <w:r>
         <w:t xml:space="preserve"> </w:t>
@@ -7936,317 +7873,115 @@
           <w:rPr>
             <w:rStyle w:val="Hyperlink"/>
           </w:rPr>
-          <w:t xml:space="preserve">https://doi.org/10.1890/02-0618</w:t>
+          <w:t xml:space="preserve">Generalized additive models: An introduction with</w:t>
+        </w:r>
+        <w:r>
+          <w:rPr>
+            <w:rStyle w:val="Hyperlink"/>
+          </w:rPr>
+          <w:t xml:space="preserve"> </w:t>
+        </w:r>
+        <w:r>
+          <w:rPr>
+            <w:rStyle w:val="Hyperlink"/>
+          </w:rPr>
+          <w:t xml:space="preserve">R</w:t>
         </w:r>
       </w:hyperlink>
       <w:r>
+        <w:t xml:space="preserve">. Chapman; Hall/CRC.</w:t>
+      </w:r>
+    </w:p>
+    <w:bookmarkEnd w:id="202"/>
+    <w:bookmarkStart w:id="204" w:name="ref-Woolway2021"/>
+    <w:p>
+      <w:pPr>
+        <w:pStyle w:val="Bibliography"/>
+      </w:pPr>
+      <w:r>
+        <w:t xml:space="preserve">Woolway, R. I., S. Sharma, G. A. Weyhenmeyer, A. Debolskiy, M. Golub, D. Mercado-Bettín, M. Perroud, V. Stepanenko, Z. Tan, L. Grant, &amp; others</w:t>
+      </w:r>
+      <w:r>
+        <w:t xml:space="preserve">, 2021. Phenological shifts in lake stratification under climate change. Nature Communications 12: 2318.</w:t>
+      </w:r>
+      <w:r>
+        <w:t xml:space="preserve"> </w:t>
+      </w:r>
+      <w:hyperlink r:id="rId203">
+        <w:r>
+          <w:rPr>
+            <w:rStyle w:val="Hyperlink"/>
+          </w:rPr>
+          <w:t xml:space="preserve">https://doi.org/10.1038/s41467-021-22657-4</w:t>
+        </w:r>
+      </w:hyperlink>
+      <w:r>
         <w:t xml:space="preserve">.</w:t>
       </w:r>
     </w:p>
-    <w:bookmarkEnd w:id="202"/>
-    <w:bookmarkStart w:id="204" w:name="ref-Vedia2017"/>
+    <w:bookmarkEnd w:id="204"/>
+    <w:bookmarkStart w:id="206" w:name="ref-Zhang2024"/>
     <w:p>
       <w:pPr>
         <w:pStyle w:val="Bibliography"/>
       </w:pPr>
       <w:r>
-        <w:t xml:space="preserve">Vedia, I., D. Galicia, E. Baquero, J. Oscoz, &amp; R. Miranda, 2017. Environmental factors influencing the distribution and abundance of the introduced signal crayfish in the north of</w:t>
-      </w:r>
-      <w:r>
-        <w:t xml:space="preserve"> </w:t>
-      </w:r>
-      <w:r>
-        <w:t xml:space="preserve">Iberian Peninsula</w:t>
-      </w:r>
-      <w:r>
-        <w:t xml:space="preserve">. Marine and Freshwater Research 68: 900–908.</w:t>
-      </w:r>
-      <w:r>
-        <w:t xml:space="preserve"> </w:t>
-      </w:r>
-      <w:hyperlink r:id="rId203">
-        <w:r>
-          <w:rPr>
-            <w:rStyle w:val="Hyperlink"/>
-          </w:rPr>
-          <w:t xml:space="preserve">https://doi.org/10.1071/MF16020</w:t>
+        <w:t xml:space="preserve">Zhang, Y., J. Shen, L. He, J. Feng, L. Chi, &amp; X. Wang, 2024. Challenge to lake ecosystems: Changes in thermal structure triggered by climate change. Water 16: 888.</w:t>
+      </w:r>
+      <w:r>
+        <w:t xml:space="preserve"> </w:t>
+      </w:r>
+      <w:hyperlink r:id="rId205">
+        <w:r>
+          <w:rPr>
+            <w:rStyle w:val="Hyperlink"/>
+          </w:rPr>
+          <w:t xml:space="preserve">https://doi.org/10.3390/w16060888</w:t>
         </w:r>
       </w:hyperlink>
       <w:r>
         <w:t xml:space="preserve">.</w:t>
       </w:r>
     </w:p>
-    <w:bookmarkEnd w:id="204"/>
-    <w:bookmarkStart w:id="206" w:name="ref-Vincent1984"/>
+    <w:bookmarkEnd w:id="206"/>
+    <w:bookmarkStart w:id="208" w:name="ref-Zuur2009"/>
     <w:p>
       <w:pPr>
         <w:pStyle w:val="Bibliography"/>
       </w:pPr>
       <w:r>
-        <w:t xml:space="preserve">Vincent, W. F., M. M. Gibbs, &amp; S. J. Dryden, 1984. Accelerated eutrophication in a</w:t>
-      </w:r>
-      <w:r>
-        <w:t xml:space="preserve"> </w:t>
-      </w:r>
-      <w:r>
-        <w:t xml:space="preserve">New Zealand</w:t>
-      </w:r>
-      <w:r>
-        <w:t xml:space="preserve"> </w:t>
-      </w:r>
-      <w:r>
-        <w:t xml:space="preserve">lake:</w:t>
-      </w:r>
-      <w:r>
-        <w:t xml:space="preserve"> </w:t>
-      </w:r>
-      <w:r>
-        <w:t xml:space="preserve">Lake Rotoiti</w:t>
-      </w:r>
-      <w:r>
-        <w:t xml:space="preserve">, central</w:t>
-      </w:r>
-      <w:r>
-        <w:t xml:space="preserve"> </w:t>
-      </w:r>
-      <w:r>
-        <w:t xml:space="preserve">North Island</w:t>
-      </w:r>
-      <w:r>
-        <w:t xml:space="preserve">. New Zealand Journal of Marine and Freshwater Research 18: 431–440.</w:t>
-      </w:r>
-      <w:r>
-        <w:t xml:space="preserve"> </w:t>
-      </w:r>
-      <w:hyperlink r:id="rId205">
-        <w:r>
-          <w:rPr>
-            <w:rStyle w:val="Hyperlink"/>
-          </w:rPr>
-          <w:t xml:space="preserve">https://doi.org/10.1080/00288330.1984.9516064</w:t>
+        <w:t xml:space="preserve">Zuur, A. F., E. N. Ieno, N. Walker, A. A. Saveliev, &amp; G. M. Smith, 2009.</w:t>
+      </w:r>
+      <w:r>
+        <w:t xml:space="preserve"> </w:t>
+      </w:r>
+      <w:hyperlink r:id="rId207">
+        <w:r>
+          <w:rPr>
+            <w:rStyle w:val="Hyperlink"/>
+          </w:rPr>
+          <w:t xml:space="preserve">Mixed effects models and extensions in ecology with</w:t>
+        </w:r>
+        <w:r>
+          <w:rPr>
+            <w:rStyle w:val="Hyperlink"/>
+          </w:rPr>
+          <w:t xml:space="preserve"> </w:t>
+        </w:r>
+        <w:r>
+          <w:rPr>
+            <w:rStyle w:val="Hyperlink"/>
+          </w:rPr>
+          <w:t xml:space="preserve">R</w:t>
         </w:r>
       </w:hyperlink>
       <w:r>
-        <w:t xml:space="preserve">.</w:t>
-      </w:r>
-    </w:p>
-    <w:bookmarkEnd w:id="206"/>
-    <w:bookmarkStart w:id="208" w:name="ref-vonWesternhagen2010"/>
-    <w:p>
-      <w:pPr>
-        <w:pStyle w:val="Bibliography"/>
-      </w:pPr>
-      <w:r>
-        <w:t xml:space="preserve">Westernhagen, N. von, D. P. Hamilton, &amp; C. A. Pilditch, 2010. Temporal and spatial variations in phytoplankton productivity in surface waters of a warm-temperate, monomictic lake in</w:t>
-      </w:r>
-      <w:r>
-        <w:t xml:space="preserve"> </w:t>
-      </w:r>
-      <w:r>
-        <w:t xml:space="preserve">New Zealand</w:t>
-      </w:r>
-      <w:r>
-        <w:t xml:space="preserve">. Hydrobiologia 652: 57–70.</w:t>
-      </w:r>
-      <w:r>
-        <w:t xml:space="preserve"> </w:t>
-      </w:r>
-      <w:hyperlink r:id="rId207">
-        <w:r>
-          <w:rPr>
-            <w:rStyle w:val="Hyperlink"/>
-          </w:rPr>
-          <w:t xml:space="preserve">https://doi.org/10.1007/s10750-010-0318-4</w:t>
-        </w:r>
-      </w:hyperlink>
-      <w:r>
-        <w:t xml:space="preserve">.</w:t>
+        <w:t xml:space="preserve">. Springer.</w:t>
       </w:r>
     </w:p>
     <w:bookmarkEnd w:id="208"/>
-    <w:bookmarkStart w:id="209" w:name="ref-Wetzel2001"/>
-    <w:p>
-      <w:pPr>
-        <w:pStyle w:val="Bibliography"/>
-      </w:pPr>
-      <w:r>
-        <w:t xml:space="preserve">Wetzel, R. G., 2001. Limnology: Lake and river ecosystems. Gulf Professional Publishing.</w:t>
-      </w:r>
-    </w:p>
     <w:bookmarkEnd w:id="209"/>
-    <w:bookmarkStart w:id="211" w:name="ref-White2003"/>
-    <w:p>
-      <w:pPr>
-        <w:pStyle w:val="Bibliography"/>
-      </w:pPr>
-      <w:r>
-        <w:t xml:space="preserve">White, J., &amp; K. Irvine, 2003. The use of littoral mesohabitats and their macroinvertebrate assemblages in the ecological assessment of lakes. Aquatic Conservation: Marine and Freshwater Ecosystems 13: 331–351.</w:t>
-      </w:r>
-      <w:r>
-        <w:t xml:space="preserve"> </w:t>
-      </w:r>
-      <w:hyperlink r:id="rId210">
-        <w:r>
-          <w:rPr>
-            <w:rStyle w:val="Hyperlink"/>
-          </w:rPr>
-          <w:t xml:space="preserve">https://doi.org/10.1002/aqc.586</w:t>
-        </w:r>
-      </w:hyperlink>
-      <w:r>
-        <w:t xml:space="preserve">.</w:t>
-      </w:r>
-    </w:p>
-    <w:bookmarkEnd w:id="211"/>
-    <w:bookmarkStart w:id="213" w:name="ref-Wood2004"/>
-    <w:p>
-      <w:pPr>
-        <w:pStyle w:val="Bibliography"/>
-      </w:pPr>
-      <w:r>
-        <w:t xml:space="preserve">Wood, S. N., 2004. Stable and efficient multiple smoothing parameter estimation for generalized additive models. Journal of the American Statistical Association 99: 673–686.</w:t>
-      </w:r>
-      <w:r>
-        <w:t xml:space="preserve"> </w:t>
-      </w:r>
-      <w:hyperlink r:id="rId212">
-        <w:r>
-          <w:rPr>
-            <w:rStyle w:val="Hyperlink"/>
-          </w:rPr>
-          <w:t xml:space="preserve">https://doi.org/10.1198/016214504000000980</w:t>
-        </w:r>
-      </w:hyperlink>
-      <w:r>
-        <w:t xml:space="preserve">.</w:t>
-      </w:r>
-    </w:p>
-    <w:bookmarkEnd w:id="213"/>
-    <w:bookmarkStart w:id="215" w:name="ref-Wood2017"/>
-    <w:p>
-      <w:pPr>
-        <w:pStyle w:val="Bibliography"/>
-      </w:pPr>
-      <w:r>
-        <w:t xml:space="preserve">Wood, S. N., 2017.</w:t>
-      </w:r>
-      <w:r>
-        <w:t xml:space="preserve"> </w:t>
-      </w:r>
-      <w:hyperlink r:id="rId214">
-        <w:r>
-          <w:rPr>
-            <w:rStyle w:val="Hyperlink"/>
-          </w:rPr>
-          <w:t xml:space="preserve">Generalized additive models: An introduction with</w:t>
-        </w:r>
-        <w:r>
-          <w:rPr>
-            <w:rStyle w:val="Hyperlink"/>
-          </w:rPr>
-          <w:t xml:space="preserve"> </w:t>
-        </w:r>
-        <w:r>
-          <w:rPr>
-            <w:rStyle w:val="Hyperlink"/>
-          </w:rPr>
-          <w:t xml:space="preserve">R</w:t>
-        </w:r>
-      </w:hyperlink>
-      <w:r>
-        <w:t xml:space="preserve">. Chapman; Hall/CRC.</w:t>
-      </w:r>
-    </w:p>
-    <w:bookmarkEnd w:id="215"/>
-    <w:bookmarkStart w:id="217" w:name="ref-Woolway2021"/>
-    <w:p>
-      <w:pPr>
-        <w:pStyle w:val="Bibliography"/>
-      </w:pPr>
-      <w:r>
-        <w:t xml:space="preserve">Woolway, R. I., S. Sharma, G. A. Weyhenmeyer, A. Debolskiy, M. Golub, D. Mercado-Bettín, M. Perroud, V. Stepanenko, Z. Tan, L. Grant, &amp; others</w:t>
-      </w:r>
-      <w:r>
-        <w:t xml:space="preserve">, 2021. Phenological shifts in lake stratification under climate change. Nature Communications 12: 2318.</w:t>
-      </w:r>
-      <w:r>
-        <w:t xml:space="preserve"> </w:t>
-      </w:r>
-      <w:hyperlink r:id="rId216">
-        <w:r>
-          <w:rPr>
-            <w:rStyle w:val="Hyperlink"/>
-          </w:rPr>
-          <w:t xml:space="preserve">https://doi.org/10.1038/s41467-021-22657-4</w:t>
-        </w:r>
-      </w:hyperlink>
-      <w:r>
-        <w:t xml:space="preserve">.</w:t>
-      </w:r>
-    </w:p>
-    <w:bookmarkEnd w:id="217"/>
-    <w:bookmarkStart w:id="219" w:name="ref-Zhang2024"/>
-    <w:p>
-      <w:pPr>
-        <w:pStyle w:val="Bibliography"/>
-      </w:pPr>
-      <w:r>
-        <w:t xml:space="preserve">Zhang, Y., J. Shen, L. He, J. Feng, L. Chi, &amp; X. Wang, 2024. Challenge to lake ecosystems: Changes in thermal structure triggered by climate change. Water 16: 888.</w:t>
-      </w:r>
-      <w:r>
-        <w:t xml:space="preserve"> </w:t>
-      </w:r>
-      <w:hyperlink r:id="rId218">
-        <w:r>
-          <w:rPr>
-            <w:rStyle w:val="Hyperlink"/>
-          </w:rPr>
-          <w:t xml:space="preserve">https://doi.org/10.3390/w16060888</w:t>
-        </w:r>
-      </w:hyperlink>
-      <w:r>
-        <w:t xml:space="preserve">.</w:t>
-      </w:r>
-    </w:p>
-    <w:bookmarkEnd w:id="219"/>
-    <w:bookmarkStart w:id="221" w:name="ref-Zuur2009"/>
-    <w:p>
-      <w:pPr>
-        <w:pStyle w:val="Bibliography"/>
-      </w:pPr>
-      <w:r>
-        <w:t xml:space="preserve">Zuur, A. F., E. N. Ieno, N. Walker, A. A. Saveliev, &amp; G. M. Smith, 2009.</w:t>
-      </w:r>
-      <w:r>
-        <w:t xml:space="preserve"> </w:t>
-      </w:r>
-      <w:hyperlink r:id="rId220">
-        <w:r>
-          <w:rPr>
-            <w:rStyle w:val="Hyperlink"/>
-          </w:rPr>
-          <w:t xml:space="preserve">Mixed effects models and extensions in ecology with</w:t>
-        </w:r>
-        <w:r>
-          <w:rPr>
-            <w:rStyle w:val="Hyperlink"/>
-          </w:rPr>
-          <w:t xml:space="preserve"> </w:t>
-        </w:r>
-        <w:r>
-          <w:rPr>
-            <w:rStyle w:val="Hyperlink"/>
-          </w:rPr>
-          <w:t xml:space="preserve">R</w:t>
-        </w:r>
-      </w:hyperlink>
-      <w:r>
-        <w:t xml:space="preserve">. Springer.</w:t>
-      </w:r>
-    </w:p>
-    <w:bookmarkEnd w:id="221"/>
-    <w:bookmarkEnd w:id="222"/>
-    <w:bookmarkEnd w:id="223"/>
+    <w:bookmarkEnd w:id="210"/>
     <w:sectPr>
       <w:footerReference r:id="rId7" w:type="default"/>
       <w:pgSz w:h="16838" w:w="11906"/>

</xml_diff>

<commit_message>
updated the length weight figure heading
</commit_message>
<xml_diff>
--- a/docs/index.docx
+++ b/docs/index.docx
@@ -568,7 +568,7 @@
         <w:t xml:space="preserve">(Usio &amp; Townsend, 2000; Parkyn &amp; Collier, 2004; Jowett et al., 2008; Parkyn et al., 2009)</w:t>
       </w:r>
       <w:r>
-        <w:t xml:space="preserve">. In contrast, habitats used by kōura in lakes remains poorly understood, with previous studies largely focused on deeper offshore habitats</w:t>
+        <w:t xml:space="preserve">. In contrast, habitats used by kōura in lakes remains poorly understood, with previous studies largely focussed on deeper offshore habitats</w:t>
       </w:r>
       <w:r>
         <w:t xml:space="preserve"> </w:t>
@@ -1957,7 +1957,7 @@
             <w:r>
               <w:drawing>
                 <wp:inline>
-                  <wp:extent cx="5727700" cy="4050383"/>
+                  <wp:extent cx="4582160" cy="3240307"/>
                   <wp:effectExtent b="0" l="0" r="0" t="0"/>
                   <wp:docPr descr="" title="" id="24" name="Picture"/>
                   <a:graphic>
@@ -1978,7 +1978,7 @@
                         <pic:spPr bwMode="auto">
                           <a:xfrm>
                             <a:off x="0" y="0"/>
-                            <a:ext cx="5727700" cy="4050383"/>
+                            <a:ext cx="4582160" cy="3240307"/>
                           </a:xfrm>
                           <a:prstGeom prst="rect">
                             <a:avLst/>
@@ -3299,13 +3299,7 @@
         <w:t xml:space="preserve">(Kusabs et al., 2015b)</w:t>
       </w:r>
       <w:r>
-        <w:t xml:space="preserve">. Missing kōura weights due to failure of scale (n = 81) were estimated using a log₁₀–log₁₀ length–weight regression fitted to individuals with both measurements (n = 240), following standard approaches for weight length relationships in aquatic organisms (</w:t>
-      </w:r>
-      <w:r>
-        <w:t xml:space="preserve">(Fig. S1)</w:t>
-      </w:r>
-      <w:r>
-        <w:t xml:space="preserve">)</w:t>
+        <w:t xml:space="preserve">. Missing kōura weights due to failure of scale (n = 81) were estimated using a log₁₀–log₁₀ length–weight regression fitted to individuals with both measurements (n = 240), following standard approaches for weight length relationships in aquatic organisms ()</w:t>
       </w:r>
       <w:r>
         <w:t xml:space="preserve"> </w:t>
@@ -3948,7 +3942,7 @@
             <w:r>
               <w:drawing>
                 <wp:inline>
-                  <wp:extent cx="2743200" cy="4572000"/>
+                  <wp:extent cx="2745487" cy="4575813"/>
                   <wp:effectExtent b="0" l="0" r="0" t="0"/>
                   <wp:docPr descr="" title="" id="33" name="Picture"/>
                   <a:graphic>
@@ -3969,7 +3963,7 @@
                         <pic:spPr bwMode="auto">
                           <a:xfrm>
                             <a:off x="0" y="0"/>
-                            <a:ext cx="2743200" cy="4572000"/>
+                            <a:ext cx="2745487" cy="4575813"/>
                           </a:xfrm>
                           <a:prstGeom prst="rect">
                             <a:avLst/>
@@ -4010,13 +4004,7 @@
         <w:pStyle w:val="BodyText"/>
       </w:pPr>
       <w:r>
-        <w:t xml:space="preserve">The five lakes differed substantially in environmental and biotic characteristics (</w:t>
-      </w:r>
-      <w:r>
-        <w:t xml:space="preserve">(Table S1)</w:t>
-      </w:r>
-      <w:r>
-        <w:t xml:space="preserve">). Physical habitat structure varied among lakes, with differences in substrate index, nearshore slope, and littoral vegetation cover. Emergent macrophytes were absent from Lake Rotorua but present in the other lakes, particularly Ōkāreka, while submerged macrophyte cover at the shore was rare in Rotorua and Rotoiti but more extensive in Rotoehu and Rotomā. Water chemistry also differed markedly among lakes. Surface water temperatures were highest in Rotorua and lowest in Rotomā and Ōkāreka, while pH ranged from circum-neutral conditions in Rotorua to more alkaline conditions in Rotoehu and Rotoiti. Specific conductivity showed strong contrasts, being highest in Rotoehu and lowest in Ōkāreka. Dissolved oxygen concentrations in the littoral zone varied less among lakes but were generally lowest in Rotorua. Fish populations differed between lakes, reflecting invasion history. Catfish were detected only in Lakes Rotorua and Rotoiti, whereas goldfish occurred in all lakes but were most abundant in Rotoehu. Common bullies were found in every survey location. Trout were found sporadically in Rotorua, Rotoiti and Ōkāreka and kōaro were only caught from Ōkāreka.</w:t>
+        <w:t xml:space="preserve">The five lakes differed substantially in environmental and biotic characteristics (). Physical habitat structure varied among lakes, with differences in substrate index, nearshore slope, and littoral vegetation cover. Emergent macrophytes were absent from Lake Rotorua but present in the other lakes, particularly Ōkāreka, while submerged macrophyte cover at the shore was rare in Rotorua and Rotoiti but more extensive in Rotoehu and Rotomā. Water chemistry also differed markedly among lakes. Surface water temperatures were highest in Rotorua and lowest in Rotomā and Ōkāreka, while pH ranged from circum-neutral conditions in Rotorua to more alkaline conditions in Rotoehu and Rotoiti. Specific conductivity showed strong contrasts, being highest in Rotoehu and lowest in Ōkāreka. Dissolved oxygen concentrations in the littoral zone varied less among lakes but were generally lowest in Rotorua. Fish populations differed between lakes, reflecting invasion history. Catfish were detected only in Lakes Rotorua and Rotoiti, whereas goldfish occurred in all lakes but were most abundant in Rotoehu. Common bullies were found in every survey location. Trout were found sporadically in Rotorua, Rotoiti and Ōkāreka and kōaro were only caught from Ōkāreka.</w:t>
       </w:r>
     </w:p>
     <w:bookmarkStart w:id="40" w:name="kōura-occupancy"/>
@@ -4211,7 +4199,7 @@
             <w:r>
               <w:drawing>
                 <wp:inline>
-                  <wp:extent cx="5727700" cy="4091214"/>
+                  <wp:extent cx="4582160" cy="3272971"/>
                   <wp:effectExtent b="0" l="0" r="0" t="0"/>
                   <wp:docPr descr="" title="" id="37" name="Picture"/>
                   <a:graphic>
@@ -4232,7 +4220,7 @@
                         <pic:spPr bwMode="auto">
                           <a:xfrm>
                             <a:off x="0" y="0"/>
-                            <a:ext cx="5727700" cy="4091214"/>
+                            <a:ext cx="4582160" cy="3272971"/>
                           </a:xfrm>
                           <a:prstGeom prst="rect">
                             <a:avLst/>
@@ -4439,7 +4427,7 @@
             <w:r>
               <w:drawing>
                 <wp:inline>
-                  <wp:extent cx="4572000" cy="4156363"/>
+                  <wp:extent cx="4582160" cy="4165599"/>
                   <wp:effectExtent b="0" l="0" r="0" t="0"/>
                   <wp:docPr descr="" title="" id="42" name="Picture"/>
                   <a:graphic>
@@ -4460,7 +4448,7 @@
                         <pic:spPr bwMode="auto">
                           <a:xfrm>
                             <a:off x="0" y="0"/>
-                            <a:ext cx="4572000" cy="4156363"/>
+                            <a:ext cx="4582160" cy="4165599"/>
                           </a:xfrm>
                           <a:prstGeom prst="rect">
                             <a:avLst/>
@@ -4626,7 +4614,7 @@
             <w:r>
               <w:drawing>
                 <wp:inline>
-                  <wp:extent cx="3657600" cy="4572000"/>
+                  <wp:extent cx="3660650" cy="4575813"/>
                   <wp:effectExtent b="0" l="0" r="0" t="0"/>
                   <wp:docPr descr="" title="" id="47" name="Picture"/>
                   <a:graphic>
@@ -4647,7 +4635,7 @@
                         <pic:spPr bwMode="auto">
                           <a:xfrm>
                             <a:off x="0" y="0"/>
-                            <a:ext cx="3657600" cy="4572000"/>
+                            <a:ext cx="3660650" cy="4575813"/>
                           </a:xfrm>
                           <a:prstGeom prst="rect">
                             <a:avLst/>
@@ -6895,7 +6883,7 @@
       </w:r>
     </w:p>
     <w:bookmarkEnd w:id="142"/>
-    <w:bookmarkStart w:id="144" w:name="ref-Meerhoff2022"/>
+    <w:bookmarkStart w:id="144" w:name="ref-Meerhoff2022a"/>
     <w:p>
       <w:pPr>
         <w:pStyle w:val="Bibliography"/>

</xml_diff>

<commit_message>
updated map to be interactive for html
</commit_message>
<xml_diff>
--- a/docs/index.docx
+++ b/docs/index.docx
@@ -1926,14 +1926,6 @@
           <w:t xml:space="preserve">Article Notebook</w:t>
         </w:r>
       </w:hyperlink>
-    </w:p>
-    <w:p>
-      <w:pPr>
-        <w:pStyle w:val="BodyText"/>
-      </w:pPr>
-      <w:r>
-        <w:t xml:space="preserve"> </w:t>
-      </w:r>
     </w:p>
     <w:tbl>
       <w:tblPr>

</xml_diff>